<commit_message>
Documento del seguimiento en negro y con capturas de la aplicación
</commit_message>
<xml_diff>
--- a/docs/seguimiento/seguimiento-ranking.docx
+++ b/docs/seguimiento/seguimiento-ranking.docx
@@ -766,7 +766,6 @@
         <w:rPr>
           <w:rFonts w:ascii="Arial" w:cs="Arial" w:eastAsia="Arial" w:hAnsi="Arial"/>
           <w:b/>
-          <w:color w:val="1F3864"/>
           <w:sz w:val="32"/>
           <w:szCs w:val="32"/>
         </w:rPr>
@@ -784,7 +783,7 @@
         <w:rPr>
           <w:rFonts w:ascii="Arial" w:cs="Arial" w:eastAsia="Arial" w:hAnsi="Arial"/>
           <w:b/>
-          <w:color w:val="1F3864"/>
+          <w:color w:val="000000"/>
           <w:sz w:val="30"/>
           <w:szCs w:val="30"/>
         </w:rPr>
@@ -830,7 +829,7 @@
         <w:rPr>
           <w:rFonts w:ascii="Arial" w:cs="Arial" w:eastAsia="Arial" w:hAnsi="Arial"/>
           <w:b/>
-          <w:color w:val="1F3864"/>
+          <w:color w:val="000000"/>
           <w:sz w:val="30"/>
           <w:szCs w:val="30"/>
         </w:rPr>
@@ -1007,7 +1006,7 @@
         <w:tc>
           <w:tcPr>
             <w:tcW w:w="1300" w:type="dxa"/>
-            <w:shd w:val="clear" w:color="auto" w:fill="1F3864"/>
+            <w:shd w:val="clear" w:color="auto" w:fill="D9D9D9"/>
             <w:vAlign w:val="center"/>
           </w:tcPr>
           <w:p>
@@ -1020,7 +1019,6 @@
               <w:rPr>
                 <w:rFonts w:ascii="Arial" w:cs="Arial" w:eastAsia="Arial" w:hAnsi="Arial"/>
                 <w:b/>
-                <w:color w:val="FFFFFF"/>
                 <w:sz w:val="19"/>
                 <w:szCs w:val="19"/>
               </w:rPr>
@@ -1031,7 +1029,7 @@
         <w:tc>
           <w:tcPr>
             <w:tcW w:w="5200" w:type="dxa"/>
-            <w:shd w:val="clear" w:color="auto" w:fill="1F3864"/>
+            <w:shd w:val="clear" w:color="auto" w:fill="D9D9D9"/>
             <w:vAlign w:val="center"/>
           </w:tcPr>
           <w:p>
@@ -1044,7 +1042,6 @@
               <w:rPr>
                 <w:rFonts w:ascii="Arial" w:cs="Arial" w:eastAsia="Arial" w:hAnsi="Arial"/>
                 <w:b/>
-                <w:color w:val="FFFFFF"/>
                 <w:sz w:val="19"/>
                 <w:szCs w:val="19"/>
               </w:rPr>
@@ -1055,7 +1052,7 @@
         <w:tc>
           <w:tcPr>
             <w:tcW w:w="2400" w:type="dxa"/>
-            <w:shd w:val="clear" w:color="auto" w:fill="1F3864"/>
+            <w:shd w:val="clear" w:color="auto" w:fill="D9D9D9"/>
             <w:vAlign w:val="center"/>
           </w:tcPr>
           <w:p>
@@ -1068,7 +1065,6 @@
               <w:rPr>
                 <w:rFonts w:ascii="Arial" w:cs="Arial" w:eastAsia="Arial" w:hAnsi="Arial"/>
                 <w:b/>
-                <w:color w:val="FFFFFF"/>
                 <w:sz w:val="19"/>
                 <w:szCs w:val="19"/>
               </w:rPr>
@@ -1364,7 +1360,7 @@
         <w:rPr>
           <w:rFonts w:ascii="Arial" w:cs="Arial" w:eastAsia="Arial" w:hAnsi="Arial"/>
           <w:b/>
-          <w:color w:val="1F3864"/>
+          <w:color w:val="000000"/>
           <w:sz w:val="30"/>
           <w:szCs w:val="30"/>
         </w:rPr>
@@ -1616,7 +1612,7 @@
         <w:rPr>
           <w:rFonts w:ascii="Arial" w:cs="Arial" w:eastAsia="Arial" w:hAnsi="Arial"/>
           <w:b/>
-          <w:color w:val="1F3864"/>
+          <w:color w:val="000000"/>
           <w:sz w:val="30"/>
           <w:szCs w:val="30"/>
         </w:rPr>
@@ -1634,7 +1630,7 @@
         <w:rPr>
           <w:rFonts w:ascii="Arial" w:cs="Arial" w:eastAsia="Arial" w:hAnsi="Arial"/>
           <w:b/>
-          <w:color w:val="1F3864"/>
+          <w:color w:val="000000"/>
           <w:sz w:val="25"/>
           <w:szCs w:val="25"/>
         </w:rPr>
@@ -1891,7 +1887,7 @@
         <w:rPr>
           <w:rFonts w:ascii="Arial" w:cs="Arial" w:eastAsia="Arial" w:hAnsi="Arial"/>
           <w:b/>
-          <w:color w:val="1F3864"/>
+          <w:color w:val="000000"/>
           <w:sz w:val="25"/>
           <w:szCs w:val="25"/>
         </w:rPr>
@@ -1932,7 +1928,7 @@
                     </a:prstGeom>
                     <a:ln w="6350">
                       <a:solidFill>
-                        <a:srgbClr val="BFBFBF"/>
+                        <a:srgbClr val="808080"/>
                       </a:solidFill>
                     </a:ln>
                   </pic:spPr>
@@ -1952,7 +1948,6 @@
         <w:rPr>
           <w:rFonts w:ascii="Arial" w:cs="Arial" w:eastAsia="Arial" w:hAnsi="Arial"/>
           <w:i/>
-          <w:color w:val="595959"/>
           <w:sz w:val="18"/>
           <w:szCs w:val="18"/>
         </w:rPr>
@@ -1993,7 +1988,7 @@
                     </a:prstGeom>
                     <a:ln w="6350">
                       <a:solidFill>
-                        <a:srgbClr val="BFBFBF"/>
+                        <a:srgbClr val="808080"/>
                       </a:solidFill>
                     </a:ln>
                   </pic:spPr>
@@ -2013,7 +2008,6 @@
         <w:rPr>
           <w:rFonts w:ascii="Arial" w:cs="Arial" w:eastAsia="Arial" w:hAnsi="Arial"/>
           <w:i/>
-          <w:color w:val="595959"/>
           <w:sz w:val="18"/>
           <w:szCs w:val="18"/>
         </w:rPr>
@@ -2031,7 +2025,7 @@
         <w:rPr>
           <w:rFonts w:ascii="Arial" w:cs="Arial" w:eastAsia="Arial" w:hAnsi="Arial"/>
           <w:b/>
-          <w:color w:val="1F3864"/>
+          <w:color w:val="000000"/>
           <w:sz w:val="25"/>
           <w:szCs w:val="25"/>
         </w:rPr>
@@ -2084,7 +2078,7 @@
         <w:tc>
           <w:tcPr>
             <w:tcW w:w="1100" w:type="dxa"/>
-            <w:shd w:val="clear" w:color="auto" w:fill="1F3864"/>
+            <w:shd w:val="clear" w:color="auto" w:fill="D9D9D9"/>
             <w:vAlign w:val="center"/>
           </w:tcPr>
           <w:p>
@@ -2097,7 +2091,6 @@
               <w:rPr>
                 <w:rFonts w:ascii="Arial" w:cs="Arial" w:eastAsia="Arial" w:hAnsi="Arial"/>
                 <w:b/>
-                <w:color w:val="FFFFFF"/>
                 <w:sz w:val="19"/>
                 <w:szCs w:val="19"/>
               </w:rPr>
@@ -2108,7 +2101,7 @@
         <w:tc>
           <w:tcPr>
             <w:tcW w:w="5300" w:type="dxa"/>
-            <w:shd w:val="clear" w:color="auto" w:fill="1F3864"/>
+            <w:shd w:val="clear" w:color="auto" w:fill="D9D9D9"/>
             <w:vAlign w:val="center"/>
           </w:tcPr>
           <w:p>
@@ -2121,7 +2114,6 @@
               <w:rPr>
                 <w:rFonts w:ascii="Arial" w:cs="Arial" w:eastAsia="Arial" w:hAnsi="Arial"/>
                 <w:b/>
-                <w:color w:val="FFFFFF"/>
                 <w:sz w:val="19"/>
                 <w:szCs w:val="19"/>
               </w:rPr>
@@ -2132,7 +2124,7 @@
         <w:tc>
           <w:tcPr>
             <w:tcW w:w="2500" w:type="dxa"/>
-            <w:shd w:val="clear" w:color="auto" w:fill="1F3864"/>
+            <w:shd w:val="clear" w:color="auto" w:fill="D9D9D9"/>
             <w:vAlign w:val="center"/>
           </w:tcPr>
           <w:p>
@@ -2145,7 +2137,6 @@
               <w:rPr>
                 <w:rFonts w:ascii="Arial" w:cs="Arial" w:eastAsia="Arial" w:hAnsi="Arial"/>
                 <w:b/>
-                <w:color w:val="FFFFFF"/>
                 <w:sz w:val="19"/>
                 <w:szCs w:val="19"/>
               </w:rPr>
@@ -2694,7 +2685,7 @@
         <w:tc>
           <w:tcPr>
             <w:tcW w:w="1100" w:type="dxa"/>
-            <w:shd w:val="clear" w:color="auto" w:fill="1F3864"/>
+            <w:shd w:val="clear" w:color="auto" w:fill="D9D9D9"/>
             <w:vAlign w:val="center"/>
           </w:tcPr>
           <w:p>
@@ -2707,7 +2698,6 @@
               <w:rPr>
                 <w:rFonts w:ascii="Arial" w:cs="Arial" w:eastAsia="Arial" w:hAnsi="Arial"/>
                 <w:b/>
-                <w:color w:val="FFFFFF"/>
                 <w:sz w:val="19"/>
                 <w:szCs w:val="19"/>
               </w:rPr>
@@ -2718,7 +2708,7 @@
         <w:tc>
           <w:tcPr>
             <w:tcW w:w="5300" w:type="dxa"/>
-            <w:shd w:val="clear" w:color="auto" w:fill="1F3864"/>
+            <w:shd w:val="clear" w:color="auto" w:fill="D9D9D9"/>
             <w:vAlign w:val="center"/>
           </w:tcPr>
           <w:p>
@@ -2731,7 +2721,6 @@
               <w:rPr>
                 <w:rFonts w:ascii="Arial" w:cs="Arial" w:eastAsia="Arial" w:hAnsi="Arial"/>
                 <w:b/>
-                <w:color w:val="FFFFFF"/>
                 <w:sz w:val="19"/>
                 <w:szCs w:val="19"/>
               </w:rPr>
@@ -2742,7 +2731,7 @@
         <w:tc>
           <w:tcPr>
             <w:tcW w:w="2500" w:type="dxa"/>
-            <w:shd w:val="clear" w:color="auto" w:fill="1F3864"/>
+            <w:shd w:val="clear" w:color="auto" w:fill="D9D9D9"/>
             <w:vAlign w:val="center"/>
           </w:tcPr>
           <w:p>
@@ -2755,7 +2744,6 @@
               <w:rPr>
                 <w:rFonts w:ascii="Arial" w:cs="Arial" w:eastAsia="Arial" w:hAnsi="Arial"/>
                 <w:b/>
-                <w:color w:val="FFFFFF"/>
                 <w:sz w:val="19"/>
                 <w:szCs w:val="19"/>
               </w:rPr>
@@ -3844,7 +3832,7 @@
         <w:rPr>
           <w:rFonts w:ascii="Arial" w:cs="Arial" w:eastAsia="Arial" w:hAnsi="Arial"/>
           <w:b/>
-          <w:color w:val="1F3864"/>
+          <w:color w:val="000000"/>
           <w:sz w:val="25"/>
           <w:szCs w:val="25"/>
         </w:rPr>
@@ -3920,7 +3908,7 @@
         <w:rPr>
           <w:rFonts w:ascii="Arial" w:cs="Arial" w:eastAsia="Arial" w:hAnsi="Arial"/>
           <w:b/>
-          <w:color w:val="1F3864"/>
+          <w:color w:val="000000"/>
           <w:sz w:val="30"/>
           <w:szCs w:val="30"/>
         </w:rPr>
@@ -3938,7 +3926,7 @@
         <w:rPr>
           <w:rFonts w:ascii="Arial" w:cs="Arial" w:eastAsia="Arial" w:hAnsi="Arial"/>
           <w:b/>
-          <w:color w:val="1F3864"/>
+          <w:color w:val="000000"/>
           <w:sz w:val="25"/>
           <w:szCs w:val="25"/>
         </w:rPr>
@@ -4053,7 +4041,7 @@
         <w:rPr>
           <w:rFonts w:ascii="Arial" w:cs="Arial" w:eastAsia="Arial" w:hAnsi="Arial"/>
           <w:b/>
-          <w:color w:val="1F3864"/>
+          <w:color w:val="000000"/>
           <w:sz w:val="25"/>
           <w:szCs w:val="25"/>
         </w:rPr>
@@ -4094,7 +4082,7 @@
                     </a:prstGeom>
                     <a:ln w="6350">
                       <a:solidFill>
-                        <a:srgbClr val="BFBFBF"/>
+                        <a:srgbClr val="808080"/>
                       </a:solidFill>
                     </a:ln>
                   </pic:spPr>
@@ -4114,7 +4102,6 @@
         <w:rPr>
           <w:rFonts w:ascii="Arial" w:cs="Arial" w:eastAsia="Arial" w:hAnsi="Arial"/>
           <w:i/>
-          <w:color w:val="595959"/>
           <w:sz w:val="18"/>
           <w:szCs w:val="18"/>
         </w:rPr>
@@ -4132,7 +4119,7 @@
         <w:rPr>
           <w:rFonts w:ascii="Arial" w:cs="Arial" w:eastAsia="Arial" w:hAnsi="Arial"/>
           <w:b/>
-          <w:color w:val="1F3864"/>
+          <w:color w:val="000000"/>
           <w:sz w:val="25"/>
           <w:szCs w:val="25"/>
         </w:rPr>
@@ -4201,7 +4188,7 @@
         <w:tc>
           <w:tcPr>
             <w:tcW w:w="1100" w:type="dxa"/>
-            <w:shd w:val="clear" w:color="auto" w:fill="1F3864"/>
+            <w:shd w:val="clear" w:color="auto" w:fill="D9D9D9"/>
             <w:vAlign w:val="center"/>
           </w:tcPr>
           <w:p>
@@ -4214,7 +4201,6 @@
               <w:rPr>
                 <w:rFonts w:ascii="Arial" w:cs="Arial" w:eastAsia="Arial" w:hAnsi="Arial"/>
                 <w:b/>
-                <w:color w:val="FFFFFF"/>
                 <w:sz w:val="19"/>
                 <w:szCs w:val="19"/>
               </w:rPr>
@@ -4225,7 +4211,7 @@
         <w:tc>
           <w:tcPr>
             <w:tcW w:w="5100" w:type="dxa"/>
-            <w:shd w:val="clear" w:color="auto" w:fill="1F3864"/>
+            <w:shd w:val="clear" w:color="auto" w:fill="D9D9D9"/>
             <w:vAlign w:val="center"/>
           </w:tcPr>
           <w:p>
@@ -4238,7 +4224,6 @@
               <w:rPr>
                 <w:rFonts w:ascii="Arial" w:cs="Arial" w:eastAsia="Arial" w:hAnsi="Arial"/>
                 <w:b/>
-                <w:color w:val="FFFFFF"/>
                 <w:sz w:val="19"/>
                 <w:szCs w:val="19"/>
               </w:rPr>
@@ -4249,7 +4234,7 @@
         <w:tc>
           <w:tcPr>
             <w:tcW w:w="2700" w:type="dxa"/>
-            <w:shd w:val="clear" w:color="auto" w:fill="1F3864"/>
+            <w:shd w:val="clear" w:color="auto" w:fill="D9D9D9"/>
             <w:vAlign w:val="center"/>
           </w:tcPr>
           <w:p>
@@ -4262,7 +4247,6 @@
               <w:rPr>
                 <w:rFonts w:ascii="Arial" w:cs="Arial" w:eastAsia="Arial" w:hAnsi="Arial"/>
                 <w:b/>
-                <w:color w:val="FFFFFF"/>
                 <w:sz w:val="19"/>
                 <w:szCs w:val="19"/>
               </w:rPr>
@@ -5351,7 +5335,7 @@
         <w:rPr>
           <w:rFonts w:ascii="Arial" w:cs="Arial" w:eastAsia="Arial" w:hAnsi="Arial"/>
           <w:b/>
-          <w:color w:val="1F3864"/>
+          <w:color w:val="000000"/>
           <w:sz w:val="25"/>
           <w:szCs w:val="25"/>
         </w:rPr>
@@ -5427,7 +5411,7 @@
         <w:rPr>
           <w:rFonts w:ascii="Arial" w:cs="Arial" w:eastAsia="Arial" w:hAnsi="Arial"/>
           <w:b/>
-          <w:color w:val="1F3864"/>
+          <w:color w:val="000000"/>
           <w:sz w:val="30"/>
           <w:szCs w:val="30"/>
         </w:rPr>
@@ -5445,7 +5429,7 @@
         <w:rPr>
           <w:rFonts w:ascii="Arial" w:cs="Arial" w:eastAsia="Arial" w:hAnsi="Arial"/>
           <w:b/>
-          <w:color w:val="1F3864"/>
+          <w:color w:val="000000"/>
           <w:sz w:val="25"/>
           <w:szCs w:val="25"/>
         </w:rPr>
@@ -5521,7 +5505,7 @@
         <w:rPr>
           <w:rFonts w:ascii="Arial" w:cs="Arial" w:eastAsia="Arial" w:hAnsi="Arial"/>
           <w:b/>
-          <w:color w:val="1F3864"/>
+          <w:color w:val="000000"/>
           <w:sz w:val="25"/>
           <w:szCs w:val="25"/>
         </w:rPr>
@@ -5562,7 +5546,7 @@
                     </a:prstGeom>
                     <a:ln w="6350">
                       <a:solidFill>
-                        <a:srgbClr val="BFBFBF"/>
+                        <a:srgbClr val="808080"/>
                       </a:solidFill>
                     </a:ln>
                   </pic:spPr>
@@ -5582,7 +5566,6 @@
         <w:rPr>
           <w:rFonts w:ascii="Arial" w:cs="Arial" w:eastAsia="Arial" w:hAnsi="Arial"/>
           <w:i/>
-          <w:color w:val="595959"/>
           <w:sz w:val="18"/>
           <w:szCs w:val="18"/>
         </w:rPr>
@@ -5623,7 +5606,7 @@
                     </a:prstGeom>
                     <a:ln w="6350">
                       <a:solidFill>
-                        <a:srgbClr val="BFBFBF"/>
+                        <a:srgbClr val="808080"/>
                       </a:solidFill>
                     </a:ln>
                   </pic:spPr>
@@ -5643,7 +5626,6 @@
         <w:rPr>
           <w:rFonts w:ascii="Arial" w:cs="Arial" w:eastAsia="Arial" w:hAnsi="Arial"/>
           <w:i/>
-          <w:color w:val="595959"/>
           <w:sz w:val="18"/>
           <w:szCs w:val="18"/>
         </w:rPr>
@@ -5661,7 +5643,7 @@
         <w:rPr>
           <w:rFonts w:ascii="Arial" w:cs="Arial" w:eastAsia="Arial" w:hAnsi="Arial"/>
           <w:b/>
-          <w:color w:val="1F3864"/>
+          <w:color w:val="000000"/>
           <w:sz w:val="25"/>
           <w:szCs w:val="25"/>
         </w:rPr>
@@ -5714,7 +5696,7 @@
         <w:tc>
           <w:tcPr>
             <w:tcW w:w="1100" w:type="dxa"/>
-            <w:shd w:val="clear" w:color="auto" w:fill="1F3864"/>
+            <w:shd w:val="clear" w:color="auto" w:fill="D9D9D9"/>
             <w:vAlign w:val="center"/>
           </w:tcPr>
           <w:p>
@@ -5727,7 +5709,6 @@
               <w:rPr>
                 <w:rFonts w:ascii="Arial" w:cs="Arial" w:eastAsia="Arial" w:hAnsi="Arial"/>
                 <w:b/>
-                <w:color w:val="FFFFFF"/>
                 <w:sz w:val="19"/>
                 <w:szCs w:val="19"/>
               </w:rPr>
@@ -5738,7 +5719,7 @@
         <w:tc>
           <w:tcPr>
             <w:tcW w:w="5300" w:type="dxa"/>
-            <w:shd w:val="clear" w:color="auto" w:fill="1F3864"/>
+            <w:shd w:val="clear" w:color="auto" w:fill="D9D9D9"/>
             <w:vAlign w:val="center"/>
           </w:tcPr>
           <w:p>
@@ -5751,7 +5732,6 @@
               <w:rPr>
                 <w:rFonts w:ascii="Arial" w:cs="Arial" w:eastAsia="Arial" w:hAnsi="Arial"/>
                 <w:b/>
-                <w:color w:val="FFFFFF"/>
                 <w:sz w:val="19"/>
                 <w:szCs w:val="19"/>
               </w:rPr>
@@ -5762,7 +5742,7 @@
         <w:tc>
           <w:tcPr>
             <w:tcW w:w="2500" w:type="dxa"/>
-            <w:shd w:val="clear" w:color="auto" w:fill="1F3864"/>
+            <w:shd w:val="clear" w:color="auto" w:fill="D9D9D9"/>
             <w:vAlign w:val="center"/>
           </w:tcPr>
           <w:p>
@@ -5775,7 +5755,6 @@
               <w:rPr>
                 <w:rFonts w:ascii="Arial" w:cs="Arial" w:eastAsia="Arial" w:hAnsi="Arial"/>
                 <w:b/>
-                <w:color w:val="FFFFFF"/>
                 <w:sz w:val="19"/>
                 <w:szCs w:val="19"/>
               </w:rPr>
@@ -6256,7 +6235,7 @@
         <w:tc>
           <w:tcPr>
             <w:tcW w:w="1100" w:type="dxa"/>
-            <w:shd w:val="clear" w:color="auto" w:fill="1F3864"/>
+            <w:shd w:val="clear" w:color="auto" w:fill="D9D9D9"/>
             <w:vAlign w:val="center"/>
           </w:tcPr>
           <w:p>
@@ -6269,7 +6248,6 @@
               <w:rPr>
                 <w:rFonts w:ascii="Arial" w:cs="Arial" w:eastAsia="Arial" w:hAnsi="Arial"/>
                 <w:b/>
-                <w:color w:val="FFFFFF"/>
                 <w:sz w:val="19"/>
                 <w:szCs w:val="19"/>
               </w:rPr>
@@ -6280,7 +6258,7 @@
         <w:tc>
           <w:tcPr>
             <w:tcW w:w="5300" w:type="dxa"/>
-            <w:shd w:val="clear" w:color="auto" w:fill="1F3864"/>
+            <w:shd w:val="clear" w:color="auto" w:fill="D9D9D9"/>
             <w:vAlign w:val="center"/>
           </w:tcPr>
           <w:p>
@@ -6293,7 +6271,6 @@
               <w:rPr>
                 <w:rFonts w:ascii="Arial" w:cs="Arial" w:eastAsia="Arial" w:hAnsi="Arial"/>
                 <w:b/>
-                <w:color w:val="FFFFFF"/>
                 <w:sz w:val="19"/>
                 <w:szCs w:val="19"/>
               </w:rPr>
@@ -6304,7 +6281,7 @@
         <w:tc>
           <w:tcPr>
             <w:tcW w:w="2500" w:type="dxa"/>
-            <w:shd w:val="clear" w:color="auto" w:fill="1F3864"/>
+            <w:shd w:val="clear" w:color="auto" w:fill="D9D9D9"/>
             <w:vAlign w:val="center"/>
           </w:tcPr>
           <w:p>
@@ -6317,7 +6294,6 @@
               <w:rPr>
                 <w:rFonts w:ascii="Arial" w:cs="Arial" w:eastAsia="Arial" w:hAnsi="Arial"/>
                 <w:b/>
-                <w:color w:val="FFFFFF"/>
                 <w:sz w:val="19"/>
                 <w:szCs w:val="19"/>
               </w:rPr>
@@ -7875,7 +7851,7 @@
         <w:rPr>
           <w:rFonts w:ascii="Arial" w:cs="Arial" w:eastAsia="Arial" w:hAnsi="Arial"/>
           <w:b/>
-          <w:color w:val="1F3864"/>
+          <w:color w:val="000000"/>
           <w:sz w:val="25"/>
           <w:szCs w:val="25"/>
         </w:rPr>
@@ -7913,7 +7889,7 @@
         <w:tc>
           <w:tcPr>
             <w:tcW w:w="3300" w:type="dxa"/>
-            <w:shd w:val="clear" w:color="auto" w:fill="1F3864"/>
+            <w:shd w:val="clear" w:color="auto" w:fill="D9D9D9"/>
             <w:vAlign w:val="center"/>
           </w:tcPr>
           <w:p>
@@ -7926,7 +7902,6 @@
               <w:rPr>
                 <w:rFonts w:ascii="Arial" w:cs="Arial" w:eastAsia="Arial" w:hAnsi="Arial"/>
                 <w:b/>
-                <w:color w:val="FFFFFF"/>
                 <w:sz w:val="19"/>
                 <w:szCs w:val="19"/>
               </w:rPr>
@@ -7937,7 +7912,7 @@
         <w:tc>
           <w:tcPr>
             <w:tcW w:w="3300" w:type="dxa"/>
-            <w:shd w:val="clear" w:color="auto" w:fill="1F3864"/>
+            <w:shd w:val="clear" w:color="auto" w:fill="D9D9D9"/>
             <w:vAlign w:val="center"/>
           </w:tcPr>
           <w:p>
@@ -7950,7 +7925,6 @@
               <w:rPr>
                 <w:rFonts w:ascii="Arial" w:cs="Arial" w:eastAsia="Arial" w:hAnsi="Arial"/>
                 <w:b/>
-                <w:color w:val="FFFFFF"/>
                 <w:sz w:val="19"/>
                 <w:szCs w:val="19"/>
               </w:rPr>
@@ -7961,7 +7935,7 @@
         <w:tc>
           <w:tcPr>
             <w:tcW w:w="2300" w:type="dxa"/>
-            <w:shd w:val="clear" w:color="auto" w:fill="1F3864"/>
+            <w:shd w:val="clear" w:color="auto" w:fill="D9D9D9"/>
             <w:vAlign w:val="center"/>
           </w:tcPr>
           <w:p>
@@ -7974,7 +7948,6 @@
               <w:rPr>
                 <w:rFonts w:ascii="Arial" w:cs="Arial" w:eastAsia="Arial" w:hAnsi="Arial"/>
                 <w:b/>
-                <w:color w:val="FFFFFF"/>
                 <w:sz w:val="19"/>
                 <w:szCs w:val="19"/>
               </w:rPr>
@@ -8148,7 +8121,7 @@
         <w:rPr>
           <w:rFonts w:ascii="Arial" w:cs="Arial" w:eastAsia="Arial" w:hAnsi="Arial"/>
           <w:b/>
-          <w:color w:val="1F3864"/>
+          <w:color w:val="000000"/>
           <w:sz w:val="30"/>
           <w:szCs w:val="30"/>
         </w:rPr>
@@ -8202,7 +8175,7 @@
         <w:tc>
           <w:tcPr>
             <w:tcW w:w="2400" w:type="dxa"/>
-            <w:shd w:val="clear" w:color="auto" w:fill="1F3864"/>
+            <w:shd w:val="clear" w:color="auto" w:fill="D9D9D9"/>
             <w:vAlign w:val="center"/>
           </w:tcPr>
           <w:p>
@@ -8215,7 +8188,6 @@
               <w:rPr>
                 <w:rFonts w:ascii="Arial" w:cs="Arial" w:eastAsia="Arial" w:hAnsi="Arial"/>
                 <w:b/>
-                <w:color w:val="FFFFFF"/>
                 <w:sz w:val="19"/>
                 <w:szCs w:val="19"/>
               </w:rPr>
@@ -8226,7 +8198,7 @@
         <w:tc>
           <w:tcPr>
             <w:tcW w:w="2200" w:type="dxa"/>
-            <w:shd w:val="clear" w:color="auto" w:fill="1F3864"/>
+            <w:shd w:val="clear" w:color="auto" w:fill="D9D9D9"/>
             <w:vAlign w:val="center"/>
           </w:tcPr>
           <w:p>
@@ -8239,7 +8211,6 @@
               <w:rPr>
                 <w:rFonts w:ascii="Arial" w:cs="Arial" w:eastAsia="Arial" w:hAnsi="Arial"/>
                 <w:b/>
-                <w:color w:val="FFFFFF"/>
                 <w:sz w:val="19"/>
                 <w:szCs w:val="19"/>
               </w:rPr>
@@ -8250,7 +8221,7 @@
         <w:tc>
           <w:tcPr>
             <w:tcW w:w="2150" w:type="dxa"/>
-            <w:shd w:val="clear" w:color="auto" w:fill="1F3864"/>
+            <w:shd w:val="clear" w:color="auto" w:fill="D9D9D9"/>
             <w:vAlign w:val="center"/>
           </w:tcPr>
           <w:p>
@@ -8263,7 +8234,6 @@
               <w:rPr>
                 <w:rFonts w:ascii="Arial" w:cs="Arial" w:eastAsia="Arial" w:hAnsi="Arial"/>
                 <w:b/>
-                <w:color w:val="FFFFFF"/>
                 <w:sz w:val="19"/>
                 <w:szCs w:val="19"/>
               </w:rPr>
@@ -8274,7 +8244,7 @@
         <w:tc>
           <w:tcPr>
             <w:tcW w:w="2150" w:type="dxa"/>
-            <w:shd w:val="clear" w:color="auto" w:fill="1F3864"/>
+            <w:shd w:val="clear" w:color="auto" w:fill="D9D9D9"/>
             <w:vAlign w:val="center"/>
           </w:tcPr>
           <w:p>
@@ -8287,7 +8257,6 @@
               <w:rPr>
                 <w:rFonts w:ascii="Arial" w:cs="Arial" w:eastAsia="Arial" w:hAnsi="Arial"/>
                 <w:b/>
-                <w:color w:val="FFFFFF"/>
                 <w:sz w:val="19"/>
                 <w:szCs w:val="19"/>
               </w:rPr>
@@ -8627,7 +8596,7 @@
         <w:tc>
           <w:tcPr>
             <w:tcW w:w="1800" w:type="dxa"/>
-            <w:shd w:val="clear" w:color="auto" w:fill="1F3864"/>
+            <w:shd w:val="clear" w:color="auto" w:fill="D9D9D9"/>
             <w:vAlign w:val="center"/>
           </w:tcPr>
           <w:p>
@@ -8640,7 +8609,6 @@
               <w:rPr>
                 <w:rFonts w:ascii="Arial" w:cs="Arial" w:eastAsia="Arial" w:hAnsi="Arial"/>
                 <w:b/>
-                <w:color w:val="FFFFFF"/>
                 <w:sz w:val="19"/>
                 <w:szCs w:val="19"/>
               </w:rPr>
@@ -8651,7 +8619,7 @@
         <w:tc>
           <w:tcPr>
             <w:tcW w:w="2400" w:type="dxa"/>
-            <w:shd w:val="clear" w:color="auto" w:fill="1F3864"/>
+            <w:shd w:val="clear" w:color="auto" w:fill="D9D9D9"/>
             <w:vAlign w:val="center"/>
           </w:tcPr>
           <w:p>
@@ -8664,7 +8632,6 @@
               <w:rPr>
                 <w:rFonts w:ascii="Arial" w:cs="Arial" w:eastAsia="Arial" w:hAnsi="Arial"/>
                 <w:b/>
-                <w:color w:val="FFFFFF"/>
                 <w:sz w:val="19"/>
                 <w:szCs w:val="19"/>
               </w:rPr>
@@ -8675,7 +8642,7 @@
         <w:tc>
           <w:tcPr>
             <w:tcW w:w="2350" w:type="dxa"/>
-            <w:shd w:val="clear" w:color="auto" w:fill="1F3864"/>
+            <w:shd w:val="clear" w:color="auto" w:fill="D9D9D9"/>
             <w:vAlign w:val="center"/>
           </w:tcPr>
           <w:p>
@@ -8688,7 +8655,6 @@
               <w:rPr>
                 <w:rFonts w:ascii="Arial" w:cs="Arial" w:eastAsia="Arial" w:hAnsi="Arial"/>
                 <w:b/>
-                <w:color w:val="FFFFFF"/>
                 <w:sz w:val="19"/>
                 <w:szCs w:val="19"/>
               </w:rPr>
@@ -8699,7 +8665,7 @@
         <w:tc>
           <w:tcPr>
             <w:tcW w:w="2350" w:type="dxa"/>
-            <w:shd w:val="clear" w:color="auto" w:fill="1F3864"/>
+            <w:shd w:val="clear" w:color="auto" w:fill="D9D9D9"/>
             <w:vAlign w:val="center"/>
           </w:tcPr>
           <w:p>
@@ -8712,7 +8678,6 @@
               <w:rPr>
                 <w:rFonts w:ascii="Arial" w:cs="Arial" w:eastAsia="Arial" w:hAnsi="Arial"/>
                 <w:b/>
-                <w:color w:val="FFFFFF"/>
                 <w:sz w:val="19"/>
                 <w:szCs w:val="19"/>
               </w:rPr>
@@ -9114,7 +9079,7 @@
                     </a:prstGeom>
                     <a:ln w="6350">
                       <a:solidFill>
-                        <a:srgbClr val="BFBFBF"/>
+                        <a:srgbClr val="808080"/>
                       </a:solidFill>
                     </a:ln>
                   </pic:spPr>
@@ -9134,7 +9099,6 @@
         <w:rPr>
           <w:rFonts w:ascii="Arial" w:cs="Arial" w:eastAsia="Arial" w:hAnsi="Arial"/>
           <w:i/>
-          <w:color w:val="595959"/>
           <w:sz w:val="18"/>
           <w:szCs w:val="18"/>
         </w:rPr>
@@ -9166,7 +9130,7 @@
         <w:rPr>
           <w:rFonts w:ascii="Arial" w:cs="Arial" w:eastAsia="Arial" w:hAnsi="Arial"/>
           <w:b/>
-          <w:color w:val="1F3864"/>
+          <w:color w:val="000000"/>
           <w:sz w:val="30"/>
           <w:szCs w:val="30"/>
         </w:rPr>
@@ -9222,7 +9186,7 @@
         <w:tc>
           <w:tcPr>
             <w:tcW w:w="700" w:type="dxa"/>
-            <w:shd w:val="clear" w:color="auto" w:fill="1F3864"/>
+            <w:shd w:val="clear" w:color="auto" w:fill="D9D9D9"/>
             <w:vAlign w:val="center"/>
           </w:tcPr>
           <w:p>
@@ -9235,7 +9199,6 @@
               <w:rPr>
                 <w:rFonts w:ascii="Arial" w:cs="Arial" w:eastAsia="Arial" w:hAnsi="Arial"/>
                 <w:b/>
-                <w:color w:val="FFFFFF"/>
                 <w:sz w:val="19"/>
                 <w:szCs w:val="19"/>
               </w:rPr>
@@ -9246,7 +9209,7 @@
         <w:tc>
           <w:tcPr>
             <w:tcW w:w="2600" w:type="dxa"/>
-            <w:shd w:val="clear" w:color="auto" w:fill="1F3864"/>
+            <w:shd w:val="clear" w:color="auto" w:fill="D9D9D9"/>
             <w:vAlign w:val="center"/>
           </w:tcPr>
           <w:p>
@@ -9259,7 +9222,6 @@
               <w:rPr>
                 <w:rFonts w:ascii="Arial" w:cs="Arial" w:eastAsia="Arial" w:hAnsi="Arial"/>
                 <w:b/>
-                <w:color w:val="FFFFFF"/>
                 <w:sz w:val="19"/>
                 <w:szCs w:val="19"/>
               </w:rPr>
@@ -9270,7 +9232,7 @@
         <w:tc>
           <w:tcPr>
             <w:tcW w:w="1600" w:type="dxa"/>
-            <w:shd w:val="clear" w:color="auto" w:fill="1F3864"/>
+            <w:shd w:val="clear" w:color="auto" w:fill="D9D9D9"/>
             <w:vAlign w:val="center"/>
           </w:tcPr>
           <w:p>
@@ -9283,7 +9245,6 @@
               <w:rPr>
                 <w:rFonts w:ascii="Arial" w:cs="Arial" w:eastAsia="Arial" w:hAnsi="Arial"/>
                 <w:b/>
-                <w:color w:val="FFFFFF"/>
                 <w:sz w:val="19"/>
                 <w:szCs w:val="19"/>
               </w:rPr>
@@ -9294,7 +9255,7 @@
         <w:tc>
           <w:tcPr>
             <w:tcW w:w="1350" w:type="dxa"/>
-            <w:shd w:val="clear" w:color="auto" w:fill="1F3864"/>
+            <w:shd w:val="clear" w:color="auto" w:fill="D9D9D9"/>
             <w:vAlign w:val="center"/>
           </w:tcPr>
           <w:p>
@@ -9307,7 +9268,6 @@
               <w:rPr>
                 <w:rFonts w:ascii="Arial" w:cs="Arial" w:eastAsia="Arial" w:hAnsi="Arial"/>
                 <w:b/>
-                <w:color w:val="FFFFFF"/>
                 <w:sz w:val="19"/>
                 <w:szCs w:val="19"/>
               </w:rPr>
@@ -9318,7 +9278,7 @@
         <w:tc>
           <w:tcPr>
             <w:tcW w:w="1350" w:type="dxa"/>
-            <w:shd w:val="clear" w:color="auto" w:fill="1F3864"/>
+            <w:shd w:val="clear" w:color="auto" w:fill="D9D9D9"/>
             <w:vAlign w:val="center"/>
           </w:tcPr>
           <w:p>
@@ -9331,7 +9291,6 @@
               <w:rPr>
                 <w:rFonts w:ascii="Arial" w:cs="Arial" w:eastAsia="Arial" w:hAnsi="Arial"/>
                 <w:b/>
-                <w:color w:val="FFFFFF"/>
                 <w:sz w:val="19"/>
                 <w:szCs w:val="19"/>
               </w:rPr>
@@ -9342,7 +9301,7 @@
         <w:tc>
           <w:tcPr>
             <w:tcW w:w="1350" w:type="dxa"/>
-            <w:shd w:val="clear" w:color="auto" w:fill="1F3864"/>
+            <w:shd w:val="clear" w:color="auto" w:fill="D9D9D9"/>
             <w:vAlign w:val="center"/>
           </w:tcPr>
           <w:p>
@@ -9355,7 +9314,6 @@
               <w:rPr>
                 <w:rFonts w:ascii="Arial" w:cs="Arial" w:eastAsia="Arial" w:hAnsi="Arial"/>
                 <w:b/>
-                <w:color w:val="FFFFFF"/>
                 <w:sz w:val="19"/>
                 <w:szCs w:val="19"/>
               </w:rPr>
@@ -11341,126 +11299,339 @@
         <w:rPr>
           <w:rFonts w:ascii="Arial" w:cs="Arial" w:eastAsia="Arial" w:hAnsi="Arial"/>
           <w:b/>
-          <w:color w:val="1F3864"/>
+          <w:color w:val="000000"/>
           <w:sz w:val="30"/>
           <w:szCs w:val="30"/>
         </w:rPr>
-        <w:t xml:space="preserve">9. Conclusiones</w:t>
-      </w:r>
-    </w:p>
-    <w:p>
-      <w:pPr>
-        <w:spacing w:before="0" w:after="80" w:line="276" w:lineRule="auto"/>
-        <w:ind w:left="360"/>
-        <w:jc w:val="left"/>
-      </w:pPr>
-      <w:r>
-        <w:rPr>
-          <w:rFonts w:ascii="Arial" w:cs="Arial" w:eastAsia="Arial" w:hAnsi="Arial"/>
-          <w:sz w:val="22"/>
-          <w:szCs w:val="22"/>
-        </w:rPr>
-        <w:t xml:space="preserve">•  </w:t>
-      </w:r>
-      <w:r>
-        <w:rPr>
-          <w:rFonts w:ascii="Arial" w:cs="Arial" w:eastAsia="Arial" w:hAnsi="Arial"/>
-          <w:sz w:val="22"/>
-          <w:szCs w:val="22"/>
-        </w:rPr>
-        <w:t xml:space="preserve">Los tres algoritmos ordenan sin comparar elementos: usan la frecuencia como índice de un arreglo (Counting), de un dígito (Radix) o de una cubeta (Bucket). Por eso pueden bajar de la cota O(n log n) que tienen los ordenamientos por comparación.</w:t>
-      </w:r>
-    </w:p>
-    <w:p>
-      <w:pPr>
-        <w:spacing w:before="0" w:after="80" w:line="276" w:lineRule="auto"/>
-        <w:ind w:left="360"/>
-        <w:jc w:val="left"/>
-      </w:pPr>
-      <w:r>
-        <w:rPr>
-          <w:rFonts w:ascii="Arial" w:cs="Arial" w:eastAsia="Arial" w:hAnsi="Arial"/>
-          <w:sz w:val="22"/>
-          <w:szCs w:val="22"/>
-        </w:rPr>
-        <w:t xml:space="preserve">•  </w:t>
-      </w:r>
-      <w:r>
-        <w:rPr>
-          <w:rFonts w:ascii="Arial" w:cs="Arial" w:eastAsia="Arial" w:hAnsi="Arial"/>
-          <w:sz w:val="22"/>
-          <w:szCs w:val="22"/>
-        </w:rPr>
-        <w:t xml:space="preserve">Counting Sort tiene T(n) = 11n + 3k + 12, es decir O(n + k). Es el más rápido en el corpus porque k = 57 es pequeño.</w:t>
-      </w:r>
-    </w:p>
-    <w:p>
-      <w:pPr>
-        <w:spacing w:before="0" w:after="80" w:line="276" w:lineRule="auto"/>
-        <w:ind w:left="360"/>
-        <w:jc w:val="left"/>
-      </w:pPr>
-      <w:r>
-        <w:rPr>
-          <w:rFonts w:ascii="Arial" w:cs="Arial" w:eastAsia="Arial" w:hAnsi="Arial"/>
-          <w:sz w:val="22"/>
-          <w:szCs w:val="22"/>
-        </w:rPr>
-        <w:t xml:space="preserve">•  </w:t>
-      </w:r>
-      <w:r>
-        <w:rPr>
-          <w:rFonts w:ascii="Arial" w:cs="Arial" w:eastAsia="Arial" w:hAnsi="Arial"/>
-          <w:sz w:val="22"/>
-          <w:szCs w:val="22"/>
-        </w:rPr>
-        <w:t xml:space="preserve">Radix Sort tiene T(n) = 8dn + 3n + 38d + 8, es decir O(d · (n + b)). Con d = 2 y b = 10 es O(n), pero recorre los datos dos veces.</w:t>
-      </w:r>
-    </w:p>
-    <w:p>
-      <w:pPr>
-        <w:spacing w:before="0" w:after="80" w:line="276" w:lineRule="auto"/>
-        <w:ind w:left="360"/>
-        <w:jc w:val="left"/>
-      </w:pPr>
-      <w:r>
-        <w:rPr>
-          <w:rFonts w:ascii="Arial" w:cs="Arial" w:eastAsia="Arial" w:hAnsi="Arial"/>
-          <w:sz w:val="22"/>
-          <w:szCs w:val="22"/>
-        </w:rPr>
-        <w:t xml:space="preserve">•  </w:t>
-      </w:r>
-      <w:r>
-        <w:rPr>
-          <w:rFonts w:ascii="Arial" w:cs="Arial" w:eastAsia="Arial" w:hAnsi="Arial"/>
-          <w:sz w:val="22"/>
-          <w:szCs w:val="22"/>
-        </w:rPr>
-        <w:t xml:space="preserve">Bucket Sort tiene T(n) = 17n + 13 en el caso promedio, O(n), y O(n²) en el peor caso. En el corpus siempre se da el caso promedio.</w:t>
-      </w:r>
-    </w:p>
-    <w:p>
-      <w:pPr>
-        <w:spacing w:before="0" w:after="80" w:line="276" w:lineRule="auto"/>
-        <w:ind w:left="360"/>
-        <w:jc w:val="left"/>
-      </w:pPr>
-      <w:r>
-        <w:rPr>
-          <w:rFonts w:ascii="Arial" w:cs="Arial" w:eastAsia="Arial" w:hAnsi="Arial"/>
-          <w:sz w:val="22"/>
-          <w:szCs w:val="22"/>
-        </w:rPr>
-        <w:t xml:space="preserve">•  </w:t>
-      </w:r>
-      <w:r>
-        <w:rPr>
-          <w:rFonts w:ascii="Arial" w:cs="Arial" w:eastAsia="Arial" w:hAnsi="Arial"/>
-          <w:sz w:val="22"/>
-          <w:szCs w:val="22"/>
-        </w:rPr>
-        <w:t xml:space="preserve">Las mediciones confirman la teoría: el orden de los tiempos coincide con el de T(n) y el tiempo crece de forma lineal al duplicar n.</w:t>
+        <w:t xml:space="preserve">9. Implementación en la aplicación web</w:t>
+      </w:r>
+    </w:p>
+    <w:p>
+      <w:pPr>
+        <w:spacing w:before="0" w:after="140" w:line="276" w:lineRule="auto"/>
+        <w:jc w:val="both"/>
+      </w:pPr>
+      <w:r>
+        <w:rPr>
+          <w:rFonts w:ascii="Arial" w:cs="Arial" w:eastAsia="Arial" w:hAnsi="Arial"/>
+          <w:sz w:val="22"/>
+          <w:szCs w:val="22"/>
+        </w:rPr>
+        <w:t xml:space="preserve">El ranking de términos está integrado en la aplicación del proyecto, en la vista Ranking de términos. Al abrirla, el frontend (React) pide los datos a la API (FastAPI), que preprocesa los abstracts, ejecuta los tres algoritmos y devuelve el top 15 de cada uno junto con sus tiempos. La aplicación está publicada en https://bibliometria-algoritmica.onrender.com/ranking.</w:t>
+      </w:r>
+    </w:p>
+    <w:p>
+      <w:pPr>
+        <w:keepNext/>
+        <w:spacing w:before="0" w:after="140" w:line="276" w:lineRule="auto"/>
+        <w:jc w:val="both"/>
+      </w:pPr>
+      <w:r>
+        <w:rPr>
+          <w:rFonts w:ascii="Arial" w:cs="Arial" w:eastAsia="Arial" w:hAnsi="Arial"/>
+          <w:sz w:val="22"/>
+          <w:szCs w:val="22"/>
+        </w:rPr>
+        <w:t xml:space="preserve">En la parte superior se muestran los datos del corpus: tokens, términos distintos (n), frecuencia máxima (k) y si los tres rankings coinciden:</w:t>
+      </w:r>
+    </w:p>
+    <w:p>
+      <w:pPr>
+        <w:keepNext/>
+        <w:spacing w:before="60" w:after="40" w:line="276" w:lineRule="auto"/>
+        <w:jc w:val="center"/>
+      </w:pPr>
+      <w:r>
+        <w:drawing>
+          <wp:inline distT="0" distB="0" distL="0" distR="0">
+            <wp:extent cx="5760720" cy="1522476"/>
+            <wp:docPr id="107" name="Imagen 107"/>
+            <a:graphic xmlns:a="http://schemas.openxmlformats.org/drawingml/2006/main">
+              <a:graphicData uri="http://schemas.openxmlformats.org/drawingml/2006/picture">
+                <pic:pic xmlns:pic="http://schemas.openxmlformats.org/drawingml/2006/picture">
+                  <pic:nvPicPr>
+                    <pic:cNvPr id="107" name="seg_app_encabezado.png"/>
+                    <pic:cNvPicPr/>
+                  </pic:nvPicPr>
+                  <pic:blipFill>
+                    <a:blip r:embed="rIdSeg107"/>
+                    <a:stretch>
+                      <a:fillRect/>
+                    </a:stretch>
+                  </pic:blipFill>
+                  <pic:spPr>
+                    <a:xfrm>
+                      <a:off x="0" y="0"/>
+                      <a:ext cx="5760720" cy="1522476"/>
+                    </a:xfrm>
+                    <a:prstGeom prst="rect">
+                      <a:avLst/>
+                    </a:prstGeom>
+                    <a:ln w="6350">
+                      <a:solidFill>
+                        <a:srgbClr val="808080"/>
+                      </a:solidFill>
+                    </a:ln>
+                  </pic:spPr>
+                </pic:pic>
+              </a:graphicData>
+            </a:graphic>
+          </wp:inline>
+        </w:drawing>
+      </w:r>
+    </w:p>
+    <w:p>
+      <w:pPr>
+        <w:spacing w:before="0" w:after="200" w:line="276" w:lineRule="auto"/>
+        <w:jc w:val="center"/>
+      </w:pPr>
+      <w:r>
+        <w:rPr>
+          <w:rFonts w:ascii="Arial" w:cs="Arial" w:eastAsia="Arial" w:hAnsi="Arial"/>
+          <w:i/>
+          <w:sz w:val="18"/>
+          <w:szCs w:val="18"/>
+        </w:rPr>
+        <w:t xml:space="preserve">Figura 7. Encabezado de la vista Ranking de términos con los datos del corpus.</w:t>
+      </w:r>
+    </w:p>
+    <w:p>
+      <w:pPr>
+        <w:keepNext/>
+        <w:spacing w:before="0" w:after="140" w:line="276" w:lineRule="auto"/>
+        <w:jc w:val="both"/>
+      </w:pPr>
+      <w:r>
+        <w:rPr>
+          <w:rFonts w:ascii="Arial" w:cs="Arial" w:eastAsia="Arial" w:hAnsi="Arial"/>
+          <w:sz w:val="22"/>
+          <w:szCs w:val="22"/>
+        </w:rPr>
+        <w:t xml:space="preserve">Luego aparece el top 15. Las pestañas permiten ver el resultado de cada algoritmo por separado; los tres muestran la misma lista, como se comprobó en la sección anterior. Al lado de la tabla hay un gráfico de barras con la frecuencia de cada término:</w:t>
+      </w:r>
+    </w:p>
+    <w:p>
+      <w:pPr>
+        <w:keepNext/>
+        <w:spacing w:before="60" w:after="40" w:line="276" w:lineRule="auto"/>
+        <w:jc w:val="center"/>
+      </w:pPr>
+      <w:r>
+        <w:drawing>
+          <wp:inline distT="0" distB="0" distL="0" distR="0">
+            <wp:extent cx="5760720" cy="3516115"/>
+            <wp:docPr id="108" name="Imagen 108"/>
+            <a:graphic xmlns:a="http://schemas.openxmlformats.org/drawingml/2006/main">
+              <a:graphicData uri="http://schemas.openxmlformats.org/drawingml/2006/picture">
+                <pic:pic xmlns:pic="http://schemas.openxmlformats.org/drawingml/2006/picture">
+                  <pic:nvPicPr>
+                    <pic:cNvPr id="108" name="seg_app_top15.png"/>
+                    <pic:cNvPicPr/>
+                  </pic:nvPicPr>
+                  <pic:blipFill>
+                    <a:blip r:embed="rIdSeg108"/>
+                    <a:stretch>
+                      <a:fillRect/>
+                    </a:stretch>
+                  </pic:blipFill>
+                  <pic:spPr>
+                    <a:xfrm>
+                      <a:off x="0" y="0"/>
+                      <a:ext cx="5760720" cy="3516115"/>
+                    </a:xfrm>
+                    <a:prstGeom prst="rect">
+                      <a:avLst/>
+                    </a:prstGeom>
+                    <a:ln w="6350">
+                      <a:solidFill>
+                        <a:srgbClr val="808080"/>
+                      </a:solidFill>
+                    </a:ln>
+                  </pic:spPr>
+                </pic:pic>
+              </a:graphicData>
+            </a:graphic>
+          </wp:inline>
+        </w:drawing>
+      </w:r>
+    </w:p>
+    <w:p>
+      <w:pPr>
+        <w:spacing w:before="0" w:after="200" w:line="276" w:lineRule="auto"/>
+        <w:jc w:val="center"/>
+      </w:pPr>
+      <w:r>
+        <w:rPr>
+          <w:rFonts w:ascii="Arial" w:cs="Arial" w:eastAsia="Arial" w:hAnsi="Arial"/>
+          <w:i/>
+          <w:sz w:val="18"/>
+          <w:szCs w:val="18"/>
+        </w:rPr>
+        <w:t xml:space="preserve">Figura 8. Top 15 términos obtenido con Counting Sort, con su gráfico de barras.</w:t>
+      </w:r>
+    </w:p>
+    <w:p>
+      <w:pPr>
+        <w:keepNext/>
+        <w:spacing w:before="0" w:after="140" w:line="276" w:lineRule="auto"/>
+        <w:jc w:val="both"/>
+      </w:pPr>
+      <w:r>
+        <w:rPr>
+          <w:rFonts w:ascii="Arial" w:cs="Arial" w:eastAsia="Arial" w:hAnsi="Arial"/>
+          <w:sz w:val="22"/>
+          <w:szCs w:val="22"/>
+        </w:rPr>
+        <w:t xml:space="preserve">Debajo se comparan los tiempos. Tiempo de una ejecución muestra lo que tardó cada algoritmo en ordenar los n términos, y Benchmark repite la medición 50 veces y reporta el promedio, el mínimo y el máximo:</w:t>
+      </w:r>
+    </w:p>
+    <w:p>
+      <w:pPr>
+        <w:keepNext/>
+        <w:spacing w:before="60" w:after="40" w:line="276" w:lineRule="auto"/>
+        <w:jc w:val="center"/>
+      </w:pPr>
+      <w:r>
+        <w:drawing>
+          <wp:inline distT="0" distB="0" distL="0" distR="0">
+            <wp:extent cx="5760720" cy="1362332"/>
+            <wp:docPr id="109" name="Imagen 109"/>
+            <a:graphic xmlns:a="http://schemas.openxmlformats.org/drawingml/2006/main">
+              <a:graphicData uri="http://schemas.openxmlformats.org/drawingml/2006/picture">
+                <pic:pic xmlns:pic="http://schemas.openxmlformats.org/drawingml/2006/picture">
+                  <pic:nvPicPr>
+                    <pic:cNvPr id="109" name="seg_app_tiempos.png"/>
+                    <pic:cNvPicPr/>
+                  </pic:nvPicPr>
+                  <pic:blipFill>
+                    <a:blip r:embed="rIdSeg109"/>
+                    <a:stretch>
+                      <a:fillRect/>
+                    </a:stretch>
+                  </pic:blipFill>
+                  <pic:spPr>
+                    <a:xfrm>
+                      <a:off x="0" y="0"/>
+                      <a:ext cx="5760720" cy="1362332"/>
+                    </a:xfrm>
+                    <a:prstGeom prst="rect">
+                      <a:avLst/>
+                    </a:prstGeom>
+                    <a:ln w="6350">
+                      <a:solidFill>
+                        <a:srgbClr val="808080"/>
+                      </a:solidFill>
+                    </a:ln>
+                  </pic:spPr>
+                </pic:pic>
+              </a:graphicData>
+            </a:graphic>
+          </wp:inline>
+        </w:drawing>
+      </w:r>
+    </w:p>
+    <w:p>
+      <w:pPr>
+        <w:spacing w:before="0" w:after="200" w:line="276" w:lineRule="auto"/>
+        <w:jc w:val="center"/>
+      </w:pPr>
+      <w:r>
+        <w:rPr>
+          <w:rFonts w:ascii="Arial" w:cs="Arial" w:eastAsia="Arial" w:hAnsi="Arial"/>
+          <w:i/>
+          <w:sz w:val="18"/>
+          <w:szCs w:val="18"/>
+        </w:rPr>
+        <w:t xml:space="preserve">Figura 9. Tiempos de ejecución y benchmark en la aplicación.</w:t>
+      </w:r>
+    </w:p>
+    <w:p>
+      <w:pPr>
+        <w:keepNext/>
+        <w:spacing w:before="0" w:after="140" w:line="276" w:lineRule="auto"/>
+        <w:jc w:val="both"/>
+      </w:pPr>
+      <w:r>
+        <w:rPr>
+          <w:rFonts w:ascii="Arial" w:cs="Arial" w:eastAsia="Arial" w:hAnsi="Arial"/>
+          <w:sz w:val="22"/>
+          <w:szCs w:val="22"/>
+        </w:rPr>
+        <w:t xml:space="preserve">Por último, la gráfica de escalamiento duplica la lista varias veces y muestra cómo crece el tiempo, lo que permite ver en la misma aplicación el comportamiento lineal:</w:t>
+      </w:r>
+    </w:p>
+    <w:p>
+      <w:pPr>
+        <w:keepNext/>
+        <w:spacing w:before="60" w:after="40" w:line="276" w:lineRule="auto"/>
+        <w:jc w:val="center"/>
+      </w:pPr>
+      <w:r>
+        <w:drawing>
+          <wp:inline distT="0" distB="0" distL="0" distR="0">
+            <wp:extent cx="5486400" cy="2224216"/>
+            <wp:docPr id="110" name="Imagen 110"/>
+            <a:graphic xmlns:a="http://schemas.openxmlformats.org/drawingml/2006/main">
+              <a:graphicData uri="http://schemas.openxmlformats.org/drawingml/2006/picture">
+                <pic:pic xmlns:pic="http://schemas.openxmlformats.org/drawingml/2006/picture">
+                  <pic:nvPicPr>
+                    <pic:cNvPr id="110" name="seg_app_escalamiento.png"/>
+                    <pic:cNvPicPr/>
+                  </pic:nvPicPr>
+                  <pic:blipFill>
+                    <a:blip r:embed="rIdSeg110"/>
+                    <a:stretch>
+                      <a:fillRect/>
+                    </a:stretch>
+                  </pic:blipFill>
+                  <pic:spPr>
+                    <a:xfrm>
+                      <a:off x="0" y="0"/>
+                      <a:ext cx="5486400" cy="2224216"/>
+                    </a:xfrm>
+                    <a:prstGeom prst="rect">
+                      <a:avLst/>
+                    </a:prstGeom>
+                    <a:ln w="6350">
+                      <a:solidFill>
+                        <a:srgbClr val="808080"/>
+                      </a:solidFill>
+                    </a:ln>
+                  </pic:spPr>
+                </pic:pic>
+              </a:graphicData>
+            </a:graphic>
+          </wp:inline>
+        </w:drawing>
+      </w:r>
+    </w:p>
+    <w:p>
+      <w:pPr>
+        <w:spacing w:before="0" w:after="200" w:line="276" w:lineRule="auto"/>
+        <w:jc w:val="center"/>
+      </w:pPr>
+      <w:r>
+        <w:rPr>
+          <w:rFonts w:ascii="Arial" w:cs="Arial" w:eastAsia="Arial" w:hAnsi="Arial"/>
+          <w:i/>
+          <w:sz w:val="18"/>
+          <w:szCs w:val="18"/>
+        </w:rPr>
+        <w:t xml:space="preserve">Figura 10. Gráfica de escalamiento en la aplicación.</w:t>
+      </w:r>
+    </w:p>
+    <w:p>
+      <w:pPr>
+        <w:spacing w:before="0" w:after="140" w:line="276" w:lineRule="auto"/>
+        <w:jc w:val="both"/>
+      </w:pPr>
+      <w:r>
+        <w:rPr>
+          <w:rFonts w:ascii="Arial" w:cs="Arial" w:eastAsia="Arial" w:hAnsi="Arial"/>
+          <w:sz w:val="22"/>
+          <w:szCs w:val="22"/>
+        </w:rPr>
+        <w:t xml:space="preserve">Los tiempos de las capturas son mayores y más variables que los de la sección 7 porque se midieron en el servidor gratuito donde está publicada la aplicación, que comparte el procesador con otros servicios. Aun así se mantiene el mismo orden: Counting Sort es el más rápido según el tiempo mínimo, y los tres crecen de forma aproximadamente lineal.</w:t>
       </w:r>
     </w:p>
     <w:p>
@@ -11474,11 +11645,144 @@
         <w:rPr>
           <w:rFonts w:ascii="Arial" w:cs="Arial" w:eastAsia="Arial" w:hAnsi="Arial"/>
           <w:b/>
-          <w:color w:val="1F3864"/>
+          <w:color w:val="000000"/>
           <w:sz w:val="30"/>
           <w:szCs w:val="30"/>
         </w:rPr>
-        <w:t xml:space="preserve">10. Referencias</w:t>
+        <w:t xml:space="preserve">10. Conclusiones</w:t>
+      </w:r>
+    </w:p>
+    <w:p>
+      <w:pPr>
+        <w:spacing w:before="0" w:after="80" w:line="276" w:lineRule="auto"/>
+        <w:ind w:left="360"/>
+        <w:jc w:val="left"/>
+      </w:pPr>
+      <w:r>
+        <w:rPr>
+          <w:rFonts w:ascii="Arial" w:cs="Arial" w:eastAsia="Arial" w:hAnsi="Arial"/>
+          <w:sz w:val="22"/>
+          <w:szCs w:val="22"/>
+        </w:rPr>
+        <w:t xml:space="preserve">•  </w:t>
+      </w:r>
+      <w:r>
+        <w:rPr>
+          <w:rFonts w:ascii="Arial" w:cs="Arial" w:eastAsia="Arial" w:hAnsi="Arial"/>
+          <w:sz w:val="22"/>
+          <w:szCs w:val="22"/>
+        </w:rPr>
+        <w:t xml:space="preserve">Los tres algoritmos ordenan sin comparar elementos: usan la frecuencia como índice de un arreglo (Counting), de un dígito (Radix) o de una cubeta (Bucket). Por eso pueden bajar de la cota O(n log n) que tienen los ordenamientos por comparación.</w:t>
+      </w:r>
+    </w:p>
+    <w:p>
+      <w:pPr>
+        <w:spacing w:before="0" w:after="80" w:line="276" w:lineRule="auto"/>
+        <w:ind w:left="360"/>
+        <w:jc w:val="left"/>
+      </w:pPr>
+      <w:r>
+        <w:rPr>
+          <w:rFonts w:ascii="Arial" w:cs="Arial" w:eastAsia="Arial" w:hAnsi="Arial"/>
+          <w:sz w:val="22"/>
+          <w:szCs w:val="22"/>
+        </w:rPr>
+        <w:t xml:space="preserve">•  </w:t>
+      </w:r>
+      <w:r>
+        <w:rPr>
+          <w:rFonts w:ascii="Arial" w:cs="Arial" w:eastAsia="Arial" w:hAnsi="Arial"/>
+          <w:sz w:val="22"/>
+          <w:szCs w:val="22"/>
+        </w:rPr>
+        <w:t xml:space="preserve">Counting Sort tiene T(n) = 11n + 3k + 12, es decir O(n + k). Es el más rápido en el corpus porque k = 57 es pequeño.</w:t>
+      </w:r>
+    </w:p>
+    <w:p>
+      <w:pPr>
+        <w:spacing w:before="0" w:after="80" w:line="276" w:lineRule="auto"/>
+        <w:ind w:left="360"/>
+        <w:jc w:val="left"/>
+      </w:pPr>
+      <w:r>
+        <w:rPr>
+          <w:rFonts w:ascii="Arial" w:cs="Arial" w:eastAsia="Arial" w:hAnsi="Arial"/>
+          <w:sz w:val="22"/>
+          <w:szCs w:val="22"/>
+        </w:rPr>
+        <w:t xml:space="preserve">•  </w:t>
+      </w:r>
+      <w:r>
+        <w:rPr>
+          <w:rFonts w:ascii="Arial" w:cs="Arial" w:eastAsia="Arial" w:hAnsi="Arial"/>
+          <w:sz w:val="22"/>
+          <w:szCs w:val="22"/>
+        </w:rPr>
+        <w:t xml:space="preserve">Radix Sort tiene T(n) = 8dn + 3n + 38d + 8, es decir O(d · (n + b)). Con d = 2 y b = 10 es O(n), pero recorre los datos dos veces.</w:t>
+      </w:r>
+    </w:p>
+    <w:p>
+      <w:pPr>
+        <w:spacing w:before="0" w:after="80" w:line="276" w:lineRule="auto"/>
+        <w:ind w:left="360"/>
+        <w:jc w:val="left"/>
+      </w:pPr>
+      <w:r>
+        <w:rPr>
+          <w:rFonts w:ascii="Arial" w:cs="Arial" w:eastAsia="Arial" w:hAnsi="Arial"/>
+          <w:sz w:val="22"/>
+          <w:szCs w:val="22"/>
+        </w:rPr>
+        <w:t xml:space="preserve">•  </w:t>
+      </w:r>
+      <w:r>
+        <w:rPr>
+          <w:rFonts w:ascii="Arial" w:cs="Arial" w:eastAsia="Arial" w:hAnsi="Arial"/>
+          <w:sz w:val="22"/>
+          <w:szCs w:val="22"/>
+        </w:rPr>
+        <w:t xml:space="preserve">Bucket Sort tiene T(n) = 17n + 13 en el caso promedio, O(n), y O(n²) en el peor caso. En el corpus siempre se da el caso promedio.</w:t>
+      </w:r>
+    </w:p>
+    <w:p>
+      <w:pPr>
+        <w:spacing w:before="0" w:after="80" w:line="276" w:lineRule="auto"/>
+        <w:ind w:left="360"/>
+        <w:jc w:val="left"/>
+      </w:pPr>
+      <w:r>
+        <w:rPr>
+          <w:rFonts w:ascii="Arial" w:cs="Arial" w:eastAsia="Arial" w:hAnsi="Arial"/>
+          <w:sz w:val="22"/>
+          <w:szCs w:val="22"/>
+        </w:rPr>
+        <w:t xml:space="preserve">•  </w:t>
+      </w:r>
+      <w:r>
+        <w:rPr>
+          <w:rFonts w:ascii="Arial" w:cs="Arial" w:eastAsia="Arial" w:hAnsi="Arial"/>
+          <w:sz w:val="22"/>
+          <w:szCs w:val="22"/>
+        </w:rPr>
+        <w:t xml:space="preserve">Las mediciones confirman la teoría: el orden de los tiempos coincide con el de T(n) y el tiempo crece de forma lineal al duplicar n.</w:t>
+      </w:r>
+    </w:p>
+    <w:p>
+      <w:pPr>
+        <w:pStyle w:val="Heading1"/>
+        <w:keepNext/>
+        <w:spacing w:before="240" w:after="160" w:line="276" w:lineRule="auto"/>
+        <w:jc w:val="left"/>
+      </w:pPr>
+      <w:r>
+        <w:rPr>
+          <w:rFonts w:ascii="Arial" w:cs="Arial" w:eastAsia="Arial" w:hAnsi="Arial"/>
+          <w:b/>
+          <w:color w:val="000000"/>
+          <w:sz w:val="30"/>
+          <w:szCs w:val="30"/>
+        </w:rPr>
+        <w:t xml:space="preserve">11. Referencias</w:t>
       </w:r>
     </w:p>
     <w:p>

</xml_diff>

<commit_message>
Seguimiento con capturas del código tomadas en VS Code
</commit_message>
<xml_diff>
--- a/docs/seguimiento/seguimiento-ranking.docx
+++ b/docs/seguimiento/seguimiento-ranking.docx
@@ -906,7 +906,7 @@
       <w:r>
         <w:drawing>
           <wp:inline distT="0" distB="0" distL="0" distR="0">
-            <wp:extent cx="5486400" cy="1478942"/>
+            <wp:extent cx="5876544" cy="1999488"/>
             <wp:docPr id="101" name="Imagen 101"/>
             <a:graphic xmlns:a="http://schemas.openxmlformats.org/drawingml/2006/main">
               <a:graphicData uri="http://schemas.openxmlformats.org/drawingml/2006/picture">
@@ -924,14 +924,14 @@
                   <pic:spPr>
                     <a:xfrm>
                       <a:off x="0" y="0"/>
-                      <a:ext cx="5486400" cy="1478942"/>
+                      <a:ext cx="5876544" cy="1999488"/>
                     </a:xfrm>
                     <a:prstGeom prst="rect">
                       <a:avLst/>
                     </a:prstGeom>
                     <a:ln w="6350">
                       <a:solidFill>
-                        <a:srgbClr val="808080"/>
+                        <a:srgbClr val="404040"/>
                       </a:solidFill>
                     </a:ln>
                   </pic:spPr>
@@ -999,7 +999,7 @@
       <w:r>
         <w:drawing>
           <wp:inline distT="0" distB="0" distL="0" distR="0">
-            <wp:extent cx="5760720" cy="3711804"/>
+            <wp:extent cx="5017008" cy="4194048"/>
             <wp:docPr id="102" name="Imagen 102"/>
             <a:graphic xmlns:a="http://schemas.openxmlformats.org/drawingml/2006/main">
               <a:graphicData uri="http://schemas.openxmlformats.org/drawingml/2006/picture">
@@ -1017,14 +1017,14 @@
                   <pic:spPr>
                     <a:xfrm>
                       <a:off x="0" y="0"/>
-                      <a:ext cx="5760720" cy="3711804"/>
+                      <a:ext cx="5017008" cy="4194048"/>
                     </a:xfrm>
                     <a:prstGeom prst="rect">
                       <a:avLst/>
                     </a:prstGeom>
                     <a:ln w="6350">
                       <a:solidFill>
-                        <a:srgbClr val="808080"/>
+                        <a:srgbClr val="404040"/>
                       </a:solidFill>
                     </a:ln>
                   </pic:spPr>
@@ -1220,7 +1220,7 @@
       <w:r>
         <w:drawing>
           <wp:inline distT="0" distB="0" distL="0" distR="0">
-            <wp:extent cx="5760720" cy="2109354"/>
+            <wp:extent cx="5120640" cy="2365248"/>
             <wp:docPr id="103" name="Imagen 103"/>
             <a:graphic xmlns:a="http://schemas.openxmlformats.org/drawingml/2006/main">
               <a:graphicData uri="http://schemas.openxmlformats.org/drawingml/2006/picture">
@@ -1238,14 +1238,14 @@
                   <pic:spPr>
                     <a:xfrm>
                       <a:off x="0" y="0"/>
-                      <a:ext cx="5760720" cy="2109354"/>
+                      <a:ext cx="5120640" cy="2365248"/>
                     </a:xfrm>
                     <a:prstGeom prst="rect">
                       <a:avLst/>
                     </a:prstGeom>
                     <a:ln w="6350">
                       <a:solidFill>
-                        <a:srgbClr val="808080"/>
+                        <a:srgbClr val="404040"/>
                       </a:solidFill>
                     </a:ln>
                   </pic:spPr>
@@ -1295,7 +1295,7 @@
       <w:r>
         <w:drawing>
           <wp:inline distT="0" distB="0" distL="0" distR="0">
-            <wp:extent cx="5760720" cy="2792544"/>
+            <wp:extent cx="4255008" cy="2609088"/>
             <wp:docPr id="104" name="Imagen 104"/>
             <a:graphic xmlns:a="http://schemas.openxmlformats.org/drawingml/2006/main">
               <a:graphicData uri="http://schemas.openxmlformats.org/drawingml/2006/picture">
@@ -1313,14 +1313,14 @@
                   <pic:spPr>
                     <a:xfrm>
                       <a:off x="0" y="0"/>
-                      <a:ext cx="5760720" cy="2792544"/>
+                      <a:ext cx="4255008" cy="2609088"/>
                     </a:xfrm>
                     <a:prstGeom prst="rect">
                       <a:avLst/>
                     </a:prstGeom>
                     <a:ln w="6350">
                       <a:solidFill>
-                        <a:srgbClr val="808080"/>
+                        <a:srgbClr val="404040"/>
                       </a:solidFill>
                     </a:ln>
                   </pic:spPr>
@@ -1471,7 +1471,7 @@
       <w:r>
         <w:drawing>
           <wp:inline distT="0" distB="0" distL="0" distR="0">
-            <wp:extent cx="5760720" cy="4205325"/>
+            <wp:extent cx="5157216" cy="4925568"/>
             <wp:docPr id="105" name="Imagen 105"/>
             <a:graphic xmlns:a="http://schemas.openxmlformats.org/drawingml/2006/main">
               <a:graphicData uri="http://schemas.openxmlformats.org/drawingml/2006/picture">
@@ -1489,14 +1489,14 @@
                   <pic:spPr>
                     <a:xfrm>
                       <a:off x="0" y="0"/>
-                      <a:ext cx="5760720" cy="4205325"/>
+                      <a:ext cx="5157216" cy="4925568"/>
                     </a:xfrm>
                     <a:prstGeom prst="rect">
                       <a:avLst/>
                     </a:prstGeom>
                     <a:ln w="6350">
                       <a:solidFill>
-                        <a:srgbClr val="808080"/>
+                        <a:srgbClr val="404040"/>
                       </a:solidFill>
                     </a:ln>
                   </pic:spPr>
@@ -1564,7 +1564,7 @@
       <w:r>
         <w:drawing>
           <wp:inline distT="0" distB="0" distL="0" distR="0">
-            <wp:extent cx="5760720" cy="1903542"/>
+            <wp:extent cx="5870448" cy="2487168"/>
             <wp:docPr id="106" name="Imagen 106"/>
             <a:graphic xmlns:a="http://schemas.openxmlformats.org/drawingml/2006/main">
               <a:graphicData uri="http://schemas.openxmlformats.org/drawingml/2006/picture">
@@ -1582,14 +1582,14 @@
                   <pic:spPr>
                     <a:xfrm>
                       <a:off x="0" y="0"/>
-                      <a:ext cx="5760720" cy="1903542"/>
+                      <a:ext cx="5870448" cy="2487168"/>
                     </a:xfrm>
                     <a:prstGeom prst="rect">
                       <a:avLst/>
                     </a:prstGeom>
                     <a:ln w="6350">
                       <a:solidFill>
-                        <a:srgbClr val="808080"/>
+                        <a:srgbClr val="404040"/>
                       </a:solidFill>
                     </a:ln>
                   </pic:spPr>
@@ -1639,7 +1639,7 @@
       <w:r>
         <w:drawing>
           <wp:inline distT="0" distB="0" distL="0" distR="0">
-            <wp:extent cx="5760720" cy="2487583"/>
+            <wp:extent cx="4559808" cy="2487168"/>
             <wp:docPr id="107" name="Imagen 107"/>
             <a:graphic xmlns:a="http://schemas.openxmlformats.org/drawingml/2006/main">
               <a:graphicData uri="http://schemas.openxmlformats.org/drawingml/2006/picture">
@@ -1657,14 +1657,14 @@
                   <pic:spPr>
                     <a:xfrm>
                       <a:off x="0" y="0"/>
-                      <a:ext cx="5760720" cy="2487583"/>
+                      <a:ext cx="4559808" cy="2487168"/>
                     </a:xfrm>
                     <a:prstGeom prst="rect">
                       <a:avLst/>
                     </a:prstGeom>
                     <a:ln w="6350">
                       <a:solidFill>
-                        <a:srgbClr val="808080"/>
+                        <a:srgbClr val="404040"/>
                       </a:solidFill>
                     </a:ln>
                   </pic:spPr>
@@ -1732,7 +1732,7 @@
       <w:r>
         <w:drawing>
           <wp:inline distT="0" distB="0" distL="0" distR="0">
-            <wp:extent cx="5760720" cy="452628"/>
+            <wp:extent cx="5370576" cy="414528"/>
             <wp:docPr id="108" name="Imagen 108"/>
             <a:graphic xmlns:a="http://schemas.openxmlformats.org/drawingml/2006/main">
               <a:graphicData uri="http://schemas.openxmlformats.org/drawingml/2006/picture">
@@ -1750,14 +1750,14 @@
                   <pic:spPr>
                     <a:xfrm>
                       <a:off x="0" y="0"/>
-                      <a:ext cx="5760720" cy="452628"/>
+                      <a:ext cx="5370576" cy="414528"/>
                     </a:xfrm>
                     <a:prstGeom prst="rect">
                       <a:avLst/>
                     </a:prstGeom>
                     <a:ln w="6350">
                       <a:solidFill>
-                        <a:srgbClr val="808080"/>
+                        <a:srgbClr val="404040"/>
                       </a:solidFill>
                     </a:ln>
                   </pic:spPr>
@@ -1792,7 +1792,7 @@
       <w:r>
         <w:drawing>
           <wp:inline distT="0" distB="0" distL="0" distR="0">
-            <wp:extent cx="5760720" cy="2070258"/>
+            <wp:extent cx="4968240" cy="2243328"/>
             <wp:docPr id="109" name="Imagen 109"/>
             <a:graphic xmlns:a="http://schemas.openxmlformats.org/drawingml/2006/main">
               <a:graphicData uri="http://schemas.openxmlformats.org/drawingml/2006/picture">
@@ -1810,14 +1810,14 @@
                   <pic:spPr>
                     <a:xfrm>
                       <a:off x="0" y="0"/>
-                      <a:ext cx="5760720" cy="2070258"/>
+                      <a:ext cx="4968240" cy="2243328"/>
                     </a:xfrm>
                     <a:prstGeom prst="rect">
                       <a:avLst/>
                     </a:prstGeom>
                     <a:ln w="6350">
                       <a:solidFill>
-                        <a:srgbClr val="808080"/>
+                        <a:srgbClr val="404040"/>
                       </a:solidFill>
                     </a:ln>
                   </pic:spPr>
@@ -1867,7 +1867,7 @@
       <w:r>
         <w:drawing>
           <wp:inline distT="0" distB="0" distL="0" distR="0">
-            <wp:extent cx="5760720" cy="1589164"/>
+            <wp:extent cx="4474464" cy="1511808"/>
             <wp:docPr id="110" name="Imagen 110"/>
             <a:graphic xmlns:a="http://schemas.openxmlformats.org/drawingml/2006/main">
               <a:graphicData uri="http://schemas.openxmlformats.org/drawingml/2006/picture">
@@ -1885,14 +1885,14 @@
                   <pic:spPr>
                     <a:xfrm>
                       <a:off x="0" y="0"/>
-                      <a:ext cx="5760720" cy="1589164"/>
+                      <a:ext cx="4474464" cy="1511808"/>
                     </a:xfrm>
                     <a:prstGeom prst="rect">
                       <a:avLst/>
                     </a:prstGeom>
                     <a:ln w="6350">
                       <a:solidFill>
-                        <a:srgbClr val="808080"/>
+                        <a:srgbClr val="404040"/>
                       </a:solidFill>
                     </a:ln>
                   </pic:spPr>
@@ -1942,7 +1942,7 @@
       <w:r>
         <w:drawing>
           <wp:inline distT="0" distB="0" distL="0" distR="0">
-            <wp:extent cx="5760720" cy="1064480"/>
+            <wp:extent cx="4767072" cy="1024128"/>
             <wp:docPr id="111" name="Imagen 111"/>
             <a:graphic xmlns:a="http://schemas.openxmlformats.org/drawingml/2006/main">
               <a:graphicData uri="http://schemas.openxmlformats.org/drawingml/2006/picture">
@@ -1960,14 +1960,14 @@
                   <pic:spPr>
                     <a:xfrm>
                       <a:off x="0" y="0"/>
-                      <a:ext cx="5760720" cy="1064480"/>
+                      <a:ext cx="4767072" cy="1024128"/>
                     </a:xfrm>
                     <a:prstGeom prst="rect">
                       <a:avLst/>
                     </a:prstGeom>
                     <a:ln w="6350">
                       <a:solidFill>
-                        <a:srgbClr val="808080"/>
+                        <a:srgbClr val="404040"/>
                       </a:solidFill>
                     </a:ln>
                   </pic:spPr>
@@ -4916,7 +4916,7 @@
       <w:r>
         <w:drawing>
           <wp:inline distT="0" distB="0" distL="0" distR="0">
-            <wp:extent cx="5760720" cy="5316220"/>
+            <wp:extent cx="4163568" cy="5047488"/>
             <wp:docPr id="112" name="Imagen 112"/>
             <a:graphic xmlns:a="http://schemas.openxmlformats.org/drawingml/2006/main">
               <a:graphicData uri="http://schemas.openxmlformats.org/drawingml/2006/picture">
@@ -4934,14 +4934,14 @@
                   <pic:spPr>
                     <a:xfrm>
                       <a:off x="0" y="0"/>
-                      <a:ext cx="5760720" cy="5316220"/>
+                      <a:ext cx="4163568" cy="5047488"/>
                     </a:xfrm>
                     <a:prstGeom prst="rect">
                       <a:avLst/>
                     </a:prstGeom>
                     <a:ln w="6350">
                       <a:solidFill>
-                        <a:srgbClr val="808080"/>
+                        <a:srgbClr val="404040"/>
                       </a:solidFill>
                     </a:ln>
                   </pic:spPr>
@@ -5014,7 +5014,7 @@
       <w:r>
         <w:drawing>
           <wp:inline distT="0" distB="0" distL="0" distR="0">
-            <wp:extent cx="5760720" cy="2716703"/>
+            <wp:extent cx="4517136" cy="2731008"/>
             <wp:docPr id="113" name="Imagen 113"/>
             <a:graphic xmlns:a="http://schemas.openxmlformats.org/drawingml/2006/main">
               <a:graphicData uri="http://schemas.openxmlformats.org/drawingml/2006/picture">
@@ -5032,14 +5032,14 @@
                   <pic:spPr>
                     <a:xfrm>
                       <a:off x="0" y="0"/>
-                      <a:ext cx="5760720" cy="2716703"/>
+                      <a:ext cx="4517136" cy="2731008"/>
                     </a:xfrm>
                     <a:prstGeom prst="rect">
                       <a:avLst/>
                     </a:prstGeom>
                     <a:ln w="6350">
                       <a:solidFill>
-                        <a:srgbClr val="808080"/>
+                        <a:srgbClr val="404040"/>
                       </a:solidFill>
                     </a:ln>
                   </pic:spPr>
@@ -6008,7 +6008,7 @@
       <w:r>
         <w:drawing>
           <wp:inline distT="0" distB="0" distL="0" distR="0">
-            <wp:extent cx="5120640" cy="1995948"/>
+            <wp:extent cx="4760976" cy="2365248"/>
             <wp:docPr id="114" name="Imagen 114"/>
             <a:graphic xmlns:a="http://schemas.openxmlformats.org/drawingml/2006/main">
               <a:graphicData uri="http://schemas.openxmlformats.org/drawingml/2006/picture">
@@ -6026,14 +6026,14 @@
                   <pic:spPr>
                     <a:xfrm>
                       <a:off x="0" y="0"/>
-                      <a:ext cx="5120640" cy="1995948"/>
+                      <a:ext cx="4760976" cy="2365248"/>
                     </a:xfrm>
                     <a:prstGeom prst="rect">
                       <a:avLst/>
                     </a:prstGeom>
                     <a:ln w="6350">
                       <a:solidFill>
-                        <a:srgbClr val="808080"/>
+                        <a:srgbClr val="404040"/>
                       </a:solidFill>
                     </a:ln>
                   </pic:spPr>
@@ -6068,7 +6068,7 @@
       <w:r>
         <w:drawing>
           <wp:inline distT="0" distB="0" distL="0" distR="0">
-            <wp:extent cx="5669280" cy="3416487"/>
+            <wp:extent cx="4864608" cy="3828288"/>
             <wp:docPr id="115" name="Imagen 115"/>
             <a:graphic xmlns:a="http://schemas.openxmlformats.org/drawingml/2006/main">
               <a:graphicData uri="http://schemas.openxmlformats.org/drawingml/2006/picture">
@@ -6086,14 +6086,14 @@
                   <pic:spPr>
                     <a:xfrm>
                       <a:off x="0" y="0"/>
-                      <a:ext cx="5669280" cy="3416487"/>
+                      <a:ext cx="4864608" cy="3828288"/>
                     </a:xfrm>
                     <a:prstGeom prst="rect">
                       <a:avLst/>
                     </a:prstGeom>
                     <a:ln w="6350">
                       <a:solidFill>
-                        <a:srgbClr val="808080"/>
+                        <a:srgbClr val="404040"/>
                       </a:solidFill>
                     </a:ln>
                   </pic:spPr>
@@ -8162,7 +8162,7 @@
       <w:r>
         <w:drawing>
           <wp:inline distT="0" distB="0" distL="0" distR="0">
-            <wp:extent cx="5760720" cy="3298012"/>
+            <wp:extent cx="5120640" cy="3828288"/>
             <wp:docPr id="116" name="Imagen 116"/>
             <a:graphic xmlns:a="http://schemas.openxmlformats.org/drawingml/2006/main">
               <a:graphicData uri="http://schemas.openxmlformats.org/drawingml/2006/picture">
@@ -8180,14 +8180,14 @@
                   <pic:spPr>
                     <a:xfrm>
                       <a:off x="0" y="0"/>
-                      <a:ext cx="5760720" cy="3298012"/>
+                      <a:ext cx="5120640" cy="3828288"/>
                     </a:xfrm>
                     <a:prstGeom prst="rect">
                       <a:avLst/>
                     </a:prstGeom>
                     <a:ln w="6350">
                       <a:solidFill>
-                        <a:srgbClr val="808080"/>
+                        <a:srgbClr val="404040"/>
                       </a:solidFill>
                     </a:ln>
                   </pic:spPr>
@@ -9626,7 +9626,7 @@
       <w:r>
         <w:drawing>
           <wp:inline distT="0" distB="0" distL="0" distR="0">
-            <wp:extent cx="5760720" cy="4521855"/>
+            <wp:extent cx="4767072" cy="4925568"/>
             <wp:docPr id="117" name="Imagen 117"/>
             <a:graphic xmlns:a="http://schemas.openxmlformats.org/drawingml/2006/main">
               <a:graphicData uri="http://schemas.openxmlformats.org/drawingml/2006/picture">
@@ -9644,14 +9644,14 @@
                   <pic:spPr>
                     <a:xfrm>
                       <a:off x="0" y="0"/>
-                      <a:ext cx="5760720" cy="4521855"/>
+                      <a:ext cx="4767072" cy="4925568"/>
                     </a:xfrm>
                     <a:prstGeom prst="rect">
                       <a:avLst/>
                     </a:prstGeom>
                     <a:ln w="6350">
                       <a:solidFill>
-                        <a:srgbClr val="808080"/>
+                        <a:srgbClr val="404040"/>
                       </a:solidFill>
                     </a:ln>
                   </pic:spPr>
@@ -9686,7 +9686,7 @@
       <w:r>
         <w:drawing>
           <wp:inline distT="0" distB="0" distL="0" distR="0">
-            <wp:extent cx="5486400" cy="1431234"/>
+            <wp:extent cx="4712208" cy="1511808"/>
             <wp:docPr id="118" name="Imagen 118"/>
             <a:graphic xmlns:a="http://schemas.openxmlformats.org/drawingml/2006/main">
               <a:graphicData uri="http://schemas.openxmlformats.org/drawingml/2006/picture">
@@ -9704,14 +9704,14 @@
                   <pic:spPr>
                     <a:xfrm>
                       <a:off x="0" y="0"/>
-                      <a:ext cx="5486400" cy="1431234"/>
+                      <a:ext cx="4712208" cy="1511808"/>
                     </a:xfrm>
                     <a:prstGeom prst="rect">
                       <a:avLst/>
                     </a:prstGeom>
                     <a:ln w="6350">
                       <a:solidFill>
-                        <a:srgbClr val="808080"/>
+                        <a:srgbClr val="404040"/>
                       </a:solidFill>
                     </a:ln>
                   </pic:spPr>
@@ -13184,7 +13184,7 @@
                     </a:prstGeom>
                     <a:ln w="6350">
                       <a:solidFill>
-                        <a:srgbClr val="808080"/>
+                        <a:srgbClr val="404040"/>
                       </a:solidFill>
                     </a:ln>
                   </pic:spPr>
@@ -15474,7 +15474,7 @@
                     </a:prstGeom>
                     <a:ln w="6350">
                       <a:solidFill>
-                        <a:srgbClr val="808080"/>
+                        <a:srgbClr val="404040"/>
                       </a:solidFill>
                     </a:ln>
                   </pic:spPr>
@@ -15549,7 +15549,7 @@
                     </a:prstGeom>
                     <a:ln w="6350">
                       <a:solidFill>
-                        <a:srgbClr val="808080"/>
+                        <a:srgbClr val="404040"/>
                       </a:solidFill>
                     </a:ln>
                   </pic:spPr>
@@ -15624,7 +15624,7 @@
                     </a:prstGeom>
                     <a:ln w="6350">
                       <a:solidFill>
-                        <a:srgbClr val="808080"/>
+                        <a:srgbClr val="404040"/>
                       </a:solidFill>
                     </a:ln>
                   </pic:spPr>
@@ -15699,7 +15699,7 @@
                     </a:prstGeom>
                     <a:ln w="6350">
                       <a:solidFill>
-                        <a:srgbClr val="808080"/>
+                        <a:srgbClr val="404040"/>
                       </a:solidFill>
                     </a:ln>
                   </pic:spPr>

</xml_diff>

<commit_message>
Seguimiento sin la sección de cómo se calcula T(n)
</commit_message>
<xml_diff>
--- a/docs/seguimiento/seguimiento-ranking.docx
+++ b/docs/seguimiento/seguimiento-ranking.docx
@@ -5469,259 +5469,7 @@
           <w:sz w:val="30"/>
           <w:szCs w:val="30"/>
         </w:rPr>
-        <w:t xml:space="preserve">4. Cómo se calcula T(n)</w:t>
-      </w:r>
-    </w:p>
-    <w:p>
-      <w:pPr>
-        <w:spacing w:before="0" w:after="140" w:line="276" w:lineRule="auto"/>
-        <w:jc w:val="both"/>
-      </w:pPr>
-      <w:r>
-        <w:rPr>
-          <w:rFonts w:ascii="Arial" w:cs="Arial" w:eastAsia="Arial" w:hAnsi="Arial"/>
-          <w:sz w:val="22"/>
-          <w:szCs w:val="22"/>
-        </w:rPr>
-        <w:t xml:space="preserve">Se sigue el mismo procedimiento de los ejercicios de tiempo de ejecución: se hace una tabla con cada línea del código y el número de veces que se ejecuta, y al final se suman todas. Las reglas usadas son:</w:t>
-      </w:r>
-    </w:p>
-    <w:p>
-      <w:pPr>
-        <w:spacing w:before="0" w:after="80" w:line="276" w:lineRule="auto"/>
-        <w:ind w:left="360"/>
-        <w:jc w:val="left"/>
-      </w:pPr>
-      <w:r>
-        <w:rPr>
-          <w:rFonts w:ascii="Arial" w:cs="Arial" w:eastAsia="Arial" w:hAnsi="Arial"/>
-          <w:sz w:val="22"/>
-          <w:szCs w:val="22"/>
-        </w:rPr>
-        <w:t xml:space="preserve">•  </w:t>
-      </w:r>
-      <w:r>
-        <w:rPr>
-          <w:rFonts w:ascii="Arial" w:cs="Arial" w:eastAsia="Arial" w:hAnsi="Arial"/>
-          <w:sz w:val="22"/>
-          <w:szCs w:val="22"/>
-        </w:rPr>
-        <w:t xml:space="preserve">Una asignación, comparación o retorno que no está dentro de un ciclo se ejecuta </w:t>
-      </w:r>
-      <w:r>
-        <w:rPr>
-          <w:rFonts w:ascii="Arial" w:cs="Arial" w:eastAsia="Arial" w:hAnsi="Arial"/>
-          <w:b/>
-          <w:sz w:val="22"/>
-          <w:szCs w:val="22"/>
-        </w:rPr>
-        <w:t xml:space="preserve">1</w:t>
-      </w:r>
-      <w:r>
-        <w:rPr>
-          <w:rFonts w:ascii="Arial" w:cs="Arial" w:eastAsia="Arial" w:hAnsi="Arial"/>
-          <w:sz w:val="22"/>
-          <w:szCs w:val="22"/>
-        </w:rPr>
-        <w:t xml:space="preserve"> vez.</w:t>
-      </w:r>
-    </w:p>
-    <w:p>
-      <w:pPr>
-        <w:spacing w:before="0" w:after="80" w:line="276" w:lineRule="auto"/>
-        <w:ind w:left="360"/>
-        <w:jc w:val="left"/>
-      </w:pPr>
-      <w:r>
-        <w:rPr>
-          <w:rFonts w:ascii="Arial" w:cs="Arial" w:eastAsia="Arial" w:hAnsi="Arial"/>
-          <w:sz w:val="22"/>
-          <w:szCs w:val="22"/>
-        </w:rPr>
-        <w:t xml:space="preserve">•  </w:t>
-      </w:r>
-      <w:r>
-        <w:rPr>
-          <w:rFonts w:ascii="Arial" w:cs="Arial" w:eastAsia="Arial" w:hAnsi="Arial"/>
-          <w:sz w:val="22"/>
-          <w:szCs w:val="22"/>
-        </w:rPr>
-        <w:t xml:space="preserve">La línea de un ciclo que da n vueltas se evalúa </w:t>
-      </w:r>
-      <w:r>
-        <w:rPr>
-          <w:rFonts w:ascii="Arial" w:cs="Arial" w:eastAsia="Arial" w:hAnsi="Arial"/>
-          <w:b/>
-          <w:sz w:val="22"/>
-          <w:szCs w:val="22"/>
-        </w:rPr>
-        <w:t xml:space="preserve">n + 1</w:t>
-      </w:r>
-      <w:r>
-        <w:rPr>
-          <w:rFonts w:ascii="Arial" w:cs="Arial" w:eastAsia="Arial" w:hAnsi="Arial"/>
-          <w:sz w:val="22"/>
-          <w:szCs w:val="22"/>
-        </w:rPr>
-        <w:t xml:space="preserve"> veces: n veces que entra y 1 vez más cuando la condición deja de cumplirse (igual que i &lt; n en los ejercicios).</w:t>
-      </w:r>
-    </w:p>
-    <w:p>
-      <w:pPr>
-        <w:spacing w:before="0" w:after="80" w:line="276" w:lineRule="auto"/>
-        <w:ind w:left="360"/>
-        <w:jc w:val="left"/>
-      </w:pPr>
-      <w:r>
-        <w:rPr>
-          <w:rFonts w:ascii="Arial" w:cs="Arial" w:eastAsia="Arial" w:hAnsi="Arial"/>
-          <w:sz w:val="22"/>
-          <w:szCs w:val="22"/>
-        </w:rPr>
-        <w:t xml:space="preserve">•  </w:t>
-      </w:r>
-      <w:r>
-        <w:rPr>
-          <w:rFonts w:ascii="Arial" w:cs="Arial" w:eastAsia="Arial" w:hAnsi="Arial"/>
-          <w:sz w:val="22"/>
-          <w:szCs w:val="22"/>
-        </w:rPr>
-        <w:t xml:space="preserve">Las líneas dentro de ese ciclo se ejecutan </w:t>
-      </w:r>
-      <w:r>
-        <w:rPr>
-          <w:rFonts w:ascii="Arial" w:cs="Arial" w:eastAsia="Arial" w:hAnsi="Arial"/>
-          <w:b/>
-          <w:sz w:val="22"/>
-          <w:szCs w:val="22"/>
-        </w:rPr>
-        <w:t xml:space="preserve">n</w:t>
-      </w:r>
-      <w:r>
-        <w:rPr>
-          <w:rFonts w:ascii="Arial" w:cs="Arial" w:eastAsia="Arial" w:hAnsi="Arial"/>
-          <w:sz w:val="22"/>
-          <w:szCs w:val="22"/>
-        </w:rPr>
-        <w:t xml:space="preserve"> veces.</w:t>
-      </w:r>
-    </w:p>
-    <w:p>
-      <w:pPr>
-        <w:spacing w:before="0" w:after="80" w:line="276" w:lineRule="auto"/>
-        <w:ind w:left="360"/>
-        <w:jc w:val="left"/>
-      </w:pPr>
-      <w:r>
-        <w:rPr>
-          <w:rFonts w:ascii="Arial" w:cs="Arial" w:eastAsia="Arial" w:hAnsi="Arial"/>
-          <w:sz w:val="22"/>
-          <w:szCs w:val="22"/>
-        </w:rPr>
-        <w:t xml:space="preserve">•  </w:t>
-      </w:r>
-      <w:r>
-        <w:rPr>
-          <w:rFonts w:ascii="Arial" w:cs="Arial" w:eastAsia="Arial" w:hAnsi="Arial"/>
-          <w:sz w:val="22"/>
-          <w:szCs w:val="22"/>
-        </w:rPr>
-        <w:t xml:space="preserve">Una asignación dentro de un if se cuenta en el peor caso, es decir, como si siempre se ejecutara.</w:t>
-      </w:r>
-    </w:p>
-    <w:p>
-      <w:pPr>
-        <w:spacing w:before="0" w:after="80" w:line="276" w:lineRule="auto"/>
-        <w:ind w:left="360"/>
-        <w:jc w:val="left"/>
-      </w:pPr>
-      <w:r>
-        <w:rPr>
-          <w:rFonts w:ascii="Arial" w:cs="Arial" w:eastAsia="Arial" w:hAnsi="Arial"/>
-          <w:sz w:val="22"/>
-          <w:szCs w:val="22"/>
-        </w:rPr>
-        <w:t xml:space="preserve">•  </w:t>
-      </w:r>
-      <w:r>
-        <w:rPr>
-          <w:rFonts w:ascii="Arial" w:cs="Arial" w:eastAsia="Arial" w:hAnsi="Arial"/>
-          <w:sz w:val="22"/>
-          <w:szCs w:val="22"/>
-        </w:rPr>
-        <w:t xml:space="preserve">Crear un arreglo de tamaño m, por ejemplo [0] * m, cuesta </w:t>
-      </w:r>
-      <w:r>
-        <w:rPr>
-          <w:rFonts w:ascii="Arial" w:cs="Arial" w:eastAsia="Arial" w:hAnsi="Arial"/>
-          <w:b/>
-          <w:sz w:val="22"/>
-          <w:szCs w:val="22"/>
-        </w:rPr>
-        <w:t xml:space="preserve">m</w:t>
-      </w:r>
-      <w:r>
-        <w:rPr>
-          <w:rFonts w:ascii="Arial" w:cs="Arial" w:eastAsia="Arial" w:hAnsi="Arial"/>
-          <w:sz w:val="22"/>
-          <w:szCs w:val="22"/>
-        </w:rPr>
-        <w:t xml:space="preserve">, porque hay que inicializar cada casilla.</w:t>
-      </w:r>
-    </w:p>
-    <w:p>
-      <w:pPr>
-        <w:spacing w:before="0" w:after="80" w:line="276" w:lineRule="auto"/>
-        <w:ind w:left="360"/>
-        <w:jc w:val="left"/>
-      </w:pPr>
-      <w:r>
-        <w:rPr>
-          <w:rFonts w:ascii="Arial" w:cs="Arial" w:eastAsia="Arial" w:hAnsi="Arial"/>
-          <w:sz w:val="22"/>
-          <w:szCs w:val="22"/>
-        </w:rPr>
-        <w:t xml:space="preserve">•  </w:t>
-      </w:r>
-      <w:r>
-        <w:rPr>
-          <w:rFonts w:ascii="Arial" w:cs="Arial" w:eastAsia="Arial" w:hAnsi="Arial"/>
-          <w:sz w:val="22"/>
-          <w:szCs w:val="22"/>
-        </w:rPr>
-        <w:t xml:space="preserve">Cada parámetro de la función principal suma 1, y llamar a una función cuesta 1 más lo que cuesta esa función.</w:t>
-      </w:r>
-    </w:p>
-    <w:p>
-      <w:pPr>
-        <w:spacing w:before="0" w:after="140" w:line="276" w:lineRule="auto"/>
-        <w:jc w:val="both"/>
-      </w:pPr>
-      <w:r>
-        <w:rPr>
-          <w:rFonts w:ascii="Arial" w:cs="Arial" w:eastAsia="Arial" w:hAnsi="Arial"/>
-          <w:sz w:val="22"/>
-          <w:szCs w:val="22"/>
-        </w:rPr>
-        <w:t xml:space="preserve">Para obtener Big O se toma el término que más crece y se eliminan las constantes. Las imágenes muestran el código exactamente como está en el proyecto, con los números de línea del archivo, y las tablas usan esos mismos números. Los comentarios y los textos de documentación (docstrings) no se ejecutan, por eso no aparecen en las tablas. Para comprobar las tablas se contaron las líneas que realmente ejecuta el programa con la herramienta sys.settrace de Python, y los conteos coinciden con las fórmulas de este documento.</w:t>
-      </w:r>
-    </w:p>
-    <w:p>
-      <w:pPr>
-        <w:pStyle w:val="Heading1"/>
-        <w:keepNext/>
-        <w:spacing w:before="240" w:after="160" w:line="276" w:lineRule="auto"/>
-        <w:jc w:val="left"/>
-      </w:pPr>
-      <w:r>
-        <w:rPr>
-          <w:rFonts w:ascii="Arial" w:cs="Arial" w:eastAsia="Arial" w:hAnsi="Arial"/>
-          <w:b/>
-          <w:color w:val="000000"/>
-          <w:sz w:val="30"/>
-          <w:szCs w:val="30"/>
-        </w:rPr>
-        <w:t xml:space="preserve">5. Counting Sort</w:t>
+        <w:t xml:space="preserve">4. Counting Sort</w:t>
       </w:r>
     </w:p>
     <w:p>
@@ -5739,7 +5487,7 @@
           <w:sz w:val="25"/>
           <w:szCs w:val="25"/>
         </w:rPr>
-        <w:t xml:space="preserve">5.1 Idea del algoritmo</w:t>
+        <w:t xml:space="preserve">4.1 Idea del algoritmo</w:t>
       </w:r>
     </w:p>
     <w:p>
@@ -5996,7 +5744,7 @@
           <w:sz w:val="25"/>
           <w:szCs w:val="25"/>
         </w:rPr>
-        <w:t xml:space="preserve">5.2 Código</w:t>
+        <w:t xml:space="preserve">4.2 Código</w:t>
       </w:r>
     </w:p>
     <w:p>
@@ -6134,7 +5882,7 @@
           <w:sz w:val="25"/>
           <w:szCs w:val="25"/>
         </w:rPr>
-        <w:t xml:space="preserve">5.3 Cálculo de T(n)</w:t>
+        <w:t xml:space="preserve">4.3 Cálculo de T(n)</w:t>
       </w:r>
     </w:p>
     <w:p>
@@ -7941,7 +7689,7 @@
           <w:sz w:val="25"/>
           <w:szCs w:val="25"/>
         </w:rPr>
-        <w:t xml:space="preserve">5.4 Big O</w:t>
+        <w:t xml:space="preserve">4.4 Big O</w:t>
       </w:r>
     </w:p>
     <w:p>
@@ -8017,7 +7765,7 @@
           <w:sz w:val="30"/>
           <w:szCs w:val="30"/>
         </w:rPr>
-        <w:t xml:space="preserve">6. Radix Sort</w:t>
+        <w:t xml:space="preserve">5. Radix Sort</w:t>
       </w:r>
     </w:p>
     <w:p>
@@ -8035,7 +7783,7 @@
           <w:sz w:val="25"/>
           <w:szCs w:val="25"/>
         </w:rPr>
-        <w:t xml:space="preserve">6.1 Idea del algoritmo</w:t>
+        <w:t xml:space="preserve">5.1 Idea del algoritmo</w:t>
       </w:r>
     </w:p>
     <w:p>
@@ -8150,7 +7898,7 @@
           <w:sz w:val="25"/>
           <w:szCs w:val="25"/>
         </w:rPr>
-        <w:t xml:space="preserve">6.2 Código</w:t>
+        <w:t xml:space="preserve">5.2 Código</w:t>
       </w:r>
     </w:p>
     <w:p>
@@ -8228,7 +7976,7 @@
           <w:sz w:val="25"/>
           <w:szCs w:val="25"/>
         </w:rPr>
-        <w:t xml:space="preserve">6.3 Cálculo de T(n)</w:t>
+        <w:t xml:space="preserve">5.3 Cálculo de T(n)</w:t>
       </w:r>
     </w:p>
     <w:p>
@@ -8243,7 +7991,7 @@
           <w:sz w:val="22"/>
           <w:szCs w:val="22"/>
         </w:rPr>
-        <w:t xml:space="preserve">El ciclo while da una vuelta por cada dígito de la frecuencia máxima, es decir, d vueltas. En cada vuelta se llama al núcleo con k = b − 1 = 9, cuyo costo, usando la fórmula de la sección 5.3, es:</w:t>
+        <w:t xml:space="preserve">El ciclo while da una vuelta por cada dígito de la frecuencia máxima, es decir, d vueltas. En cada vuelta se llama al núcleo con k = b − 1 = 9, cuyo costo, usando la fórmula de la sección 4.3, es:</w:t>
       </w:r>
     </w:p>
     <w:p>
@@ -9444,7 +9192,7 @@
           <w:sz w:val="25"/>
           <w:szCs w:val="25"/>
         </w:rPr>
-        <w:t xml:space="preserve">6.4 Big O</w:t>
+        <w:t xml:space="preserve">5.4 Big O</w:t>
       </w:r>
     </w:p>
     <w:p>
@@ -9520,7 +9268,7 @@
           <w:sz w:val="30"/>
           <w:szCs w:val="30"/>
         </w:rPr>
-        <w:t xml:space="preserve">7. Bucket Sort</w:t>
+        <w:t xml:space="preserve">6. Bucket Sort</w:t>
       </w:r>
     </w:p>
     <w:p>
@@ -9538,7 +9286,7 @@
           <w:sz w:val="25"/>
           <w:szCs w:val="25"/>
         </w:rPr>
-        <w:t xml:space="preserve">7.1 Idea del algoritmo</w:t>
+        <w:t xml:space="preserve">6.1 Idea del algoritmo</w:t>
       </w:r>
     </w:p>
     <w:p>
@@ -9614,7 +9362,7 @@
           <w:sz w:val="25"/>
           <w:szCs w:val="25"/>
         </w:rPr>
-        <w:t xml:space="preserve">7.2 Código</w:t>
+        <w:t xml:space="preserve">6.2 Código</w:t>
       </w:r>
     </w:p>
     <w:p>
@@ -9752,7 +9500,7 @@
           <w:sz w:val="25"/>
           <w:szCs w:val="25"/>
         </w:rPr>
-        <w:t xml:space="preserve">7.3 Cálculo de T(n)</w:t>
+        <w:t xml:space="preserve">6.3 Cálculo de T(n)</w:t>
       </w:r>
     </w:p>
     <w:p>
@@ -11960,7 +11708,7 @@
           <w:sz w:val="25"/>
           <w:szCs w:val="25"/>
         </w:rPr>
-        <w:t xml:space="preserve">7.4 Big O</w:t>
+        <w:t xml:space="preserve">6.4 Big O</w:t>
       </w:r>
     </w:p>
     <w:tbl>
@@ -12230,7 +11978,7 @@
           <w:sz w:val="30"/>
           <w:szCs w:val="30"/>
         </w:rPr>
-        <w:t xml:space="preserve">8. Medición empírica</w:t>
+        <w:t xml:space="preserve">7. Medición empírica</w:t>
       </w:r>
     </w:p>
     <w:p>
@@ -13239,7 +12987,7 @@
           <w:sz w:val="30"/>
           <w:szCs w:val="30"/>
         </w:rPr>
-        <w:t xml:space="preserve">9. Validación de resultados: 15 términos más frecuentes</w:t>
+        <w:t xml:space="preserve">8. Validación de resultados: 15 términos más frecuentes</w:t>
       </w:r>
     </w:p>
     <w:p>
@@ -15408,7 +15156,7 @@
           <w:sz w:val="30"/>
           <w:szCs w:val="30"/>
         </w:rPr>
-        <w:t xml:space="preserve">10. Implementación en la aplicación web</w:t>
+        <w:t xml:space="preserve">9. Implementación en la aplicación web</w:t>
       </w:r>
     </w:p>
     <w:p>
@@ -15736,7 +15484,7 @@
           <w:sz w:val="22"/>
           <w:szCs w:val="22"/>
         </w:rPr>
-        <w:t xml:space="preserve">Los tiempos de las capturas son mayores y más variables que los de la sección 8 porque se midieron en el servidor gratuito donde está publicada la aplicación, que comparte el procesador con otros servicios. Aun así se mantiene el mismo orden: Counting Sort es el más rápido según el tiempo mínimo, y los tres crecen de forma aproximadamente lineal.</w:t>
+        <w:t xml:space="preserve">Los tiempos de las capturas son mayores y más variables que los de la sección 7 porque se midieron en el servidor gratuito donde está publicada la aplicación, que comparte el procesador con otros servicios. Aun así se mantiene el mismo orden: Counting Sort es el más rápido según el tiempo mínimo, y los tres crecen de forma aproximadamente lineal.</w:t>
       </w:r>
     </w:p>
     <w:p>
@@ -15754,7 +15502,7 @@
           <w:sz w:val="30"/>
           <w:szCs w:val="30"/>
         </w:rPr>
-        <w:t xml:space="preserve">11. Conclusiones</w:t>
+        <w:t xml:space="preserve">10. Conclusiones</w:t>
       </w:r>
     </w:p>
     <w:p>
@@ -15887,7 +15635,7 @@
           <w:sz w:val="30"/>
           <w:szCs w:val="30"/>
         </w:rPr>
-        <w:t xml:space="preserve">12. Referencias</w:t>
+        <w:t xml:space="preserve">11. Referencias</w:t>
       </w:r>
     </w:p>
     <w:p>

</xml_diff>

<commit_message>
Seguimiento actualizado con la sigla AI en el ranking
</commit_message>
<xml_diff>
--- a/docs/seguimiento/seguimiento-ranking.docx
+++ b/docs/seguimiento/seguimiento-ranking.docx
@@ -4779,7 +4779,7 @@
           <w:sz w:val="22"/>
           <w:szCs w:val="22"/>
         </w:rPr>
-        <w:t xml:space="preserve">Cada abstract pasa por el mismo preprocesamiento: se convierte a minúsculas, se separa en palabras formadas solo por letras, y se eliminan las palabras vacías del inglés (the, of, and, in, entre otras) y las palabras de menos de tres letras. Con los 20 abstracts se obtiene:</w:t>
+        <w:t xml:space="preserve">Cada abstract pasa por el mismo preprocesamiento: se convierte a minúsculas, se separa en palabras formadas solo por letras, y se eliminan las palabras vacías del inglés (the, of, and, in, entre otras) y las palabras de menos de tres letras, con una excepción: la sigla AI (inteligencia artificial) se conserva porque es el tema central de los 20 artículos. Con los 20 abstracts se obtiene:</w:t>
       </w:r>
     </w:p>
     <w:p>
@@ -4803,7 +4803,7 @@
           <w:sz w:val="22"/>
           <w:szCs w:val="22"/>
         </w:rPr>
-        <w:t xml:space="preserve">2.314 tokens</w:t>
+        <w:t xml:space="preserve">2.400 tokens</w:t>
       </w:r>
       <w:r>
         <w:rPr>
@@ -4835,7 +4835,7 @@
           <w:sz w:val="22"/>
           <w:szCs w:val="22"/>
         </w:rPr>
-        <w:t xml:space="preserve">959 términos distintos</w:t>
+        <w:t xml:space="preserve">960 términos distintos</w:t>
       </w:r>
       <w:r>
         <w:rPr>
@@ -4867,7 +4867,7 @@
           <w:sz w:val="22"/>
           <w:szCs w:val="22"/>
         </w:rPr>
-        <w:t xml:space="preserve">57 como frecuencia máxima</w:t>
+        <w:t xml:space="preserve">86 como frecuencia máxima</w:t>
       </w:r>
       <w:r>
         <w:rPr>
@@ -4875,7 +4875,7 @@
           <w:sz w:val="22"/>
           <w:szCs w:val="22"/>
         </w:rPr>
-        <w:t xml:space="preserve">, que corresponde al término education.</w:t>
+        <w:t xml:space="preserve">, que corresponde a la sigla ai (inteligencia artificial).</w:t>
       </w:r>
     </w:p>
     <w:p>
@@ -4889,7 +4889,21 @@
           <w:sz w:val="22"/>
           <w:szCs w:val="22"/>
         </w:rPr>
-        <w:t xml:space="preserve">Los tres algoritmos reciben la lista de 959 pares en orden alfabético y la devuelven ordenada por frecuencia de mayor a menor. Como los tres son estables (no cambian el orden relativo de los elementos con la misma frecuencia), los empates quedan en orden alfabético y los tres producen exactamente el mismo resultado.</w:t>
+        <w:t xml:space="preserve">Los tres algoritmos reciben la lista de 960 pares en orden alfabético y la devuelven ordenada por frecuencia de mayor a menor. Como los tres son estables (no cambian el orden relativo de los elementos con la misma frecuencia), los empates quedan en orden alfabético y los tres producen exactamente el mismo resultado.</w:t>
+      </w:r>
+    </w:p>
+    <w:p>
+      <w:pPr>
+        <w:spacing w:before="0" w:after="140" w:line="276" w:lineRule="auto"/>
+        <w:jc w:val="both"/>
+      </w:pPr>
+      <w:r>
+        <w:rPr>
+          <w:rFonts w:ascii="Arial" w:cs="Arial" w:eastAsia="Arial" w:hAnsi="Arial"/>
+          <w:sz w:val="22"/>
+          <w:szCs w:val="22"/>
+        </w:rPr>
+        <w:t xml:space="preserve">El preprocesamiento se hace con estas funciones. tokenizar recorre el texto carácter por carácter y corta una palabra cada vez que encuentra algo que no es una letra; limpiar_tokens quita las palabras vacías y las cortas, y frecuencias cuenta cuántas veces aparece cada palabra usando un diccionario.</w:t>
       </w:r>
     </w:p>
     <w:p>
@@ -4904,7 +4918,7 @@
           <w:sz w:val="22"/>
           <w:szCs w:val="22"/>
         </w:rPr>
-        <w:t xml:space="preserve">El preprocesamiento se hace con estas funciones. tokenizar recorre el texto carácter por carácter y corta una palabra cada vez que encuentra algo que no es una letra; limpiar_tokens quita las palabras vacías y las cortas, y frecuencias cuenta cuántas veces aparece cada palabra usando un diccionario:</w:t>
+        <w:t xml:space="preserve">La constante SIGLAS_CONSERVADAS guarda las siglas cortas que no se deben eliminar. Sin ella, la regla de las tres letras borraría ai, que aparece 86 veces en 18 de los 20 abstracts y es el término más frecuente del corpus:</w:t>
       </w:r>
     </w:p>
     <w:p>
@@ -4916,13 +4930,13 @@
       <w:r>
         <w:drawing>
           <wp:inline distT="0" distB="0" distL="0" distR="0">
-            <wp:extent cx="4163568" cy="5047488"/>
+            <wp:extent cx="4163568" cy="4194048"/>
             <wp:docPr id="112" name="Imagen 112"/>
             <a:graphic xmlns:a="http://schemas.openxmlformats.org/drawingml/2006/main">
               <a:graphicData uri="http://schemas.openxmlformats.org/drawingml/2006/picture">
                 <pic:pic xmlns:pic="http://schemas.openxmlformats.org/drawingml/2006/picture">
                   <pic:nvPicPr>
-                    <pic:cNvPr id="112" name="seg_pre_preprocesamiento.png"/>
+                    <pic:cNvPr id="112" name="seg_pre_tokenizar.png"/>
                     <pic:cNvPicPr/>
                   </pic:nvPicPr>
                   <pic:blipFill>
@@ -4934,7 +4948,7 @@
                   <pic:spPr>
                     <a:xfrm>
                       <a:off x="0" y="0"/>
-                      <a:ext cx="4163568" cy="5047488"/>
+                      <a:ext cx="4163568" cy="4194048"/>
                     </a:xfrm>
                     <a:prstGeom prst="rect">
                       <a:avLst/>
@@ -4964,45 +4978,7 @@
           <w:sz w:val="18"/>
           <w:szCs w:val="18"/>
         </w:rPr>
-        <w:t xml:space="preserve">Figura 12. Funciones de preprocesamiento del texto. Archivo: backend/app/nucleo/preprocesamiento.py.</w:t>
-      </w:r>
-    </w:p>
-    <w:p>
-      <w:pPr>
-        <w:spacing w:before="0" w:after="140" w:line="276" w:lineRule="auto"/>
-        <w:jc w:val="both"/>
-      </w:pPr>
-      <w:r>
-        <w:rPr>
-          <w:rFonts w:ascii="Arial" w:cs="Arial" w:eastAsia="Arial" w:hAnsi="Arial"/>
-          <w:b/>
-          <w:sz w:val="22"/>
-          <w:szCs w:val="22"/>
-        </w:rPr>
-        <w:t xml:space="preserve">Ejemplo. </w:t>
-      </w:r>
-      <w:r>
-        <w:rPr>
-          <w:rFonts w:ascii="Arial" w:cs="Arial" w:eastAsia="Arial" w:hAnsi="Arial"/>
-          <w:sz w:val="22"/>
-          <w:szCs w:val="22"/>
-        </w:rPr>
-        <w:t xml:space="preserve">La frase Artificial intelligence (AI) is finding its way into education queda como los tokens artificial, intelligence, finding, way, education. Se eliminaron ai e is por tener menos de tres letras, e its e into por ser palabras vacías.</w:t>
-      </w:r>
-    </w:p>
-    <w:p>
-      <w:pPr>
-        <w:keepNext/>
-        <w:spacing w:before="0" w:after="140" w:line="276" w:lineRule="auto"/>
-        <w:jc w:val="both"/>
-      </w:pPr>
-      <w:r>
-        <w:rPr>
-          <w:rFonts w:ascii="Arial" w:cs="Arial" w:eastAsia="Arial" w:hAnsi="Arial"/>
-          <w:sz w:val="22"/>
-          <w:szCs w:val="22"/>
-        </w:rPr>
-        <w:t xml:space="preserve">Con esas funciones, el servicio del ranking une los tokens de los 20 abstracts, cuenta las frecuencias y arma la lista de pares (término, frecuencia). Esa lista se ordena una vez alfabéticamente: es solo preparación de los datos para que los empates queden en orden alfabético, no es parte de los algoritmos evaluados.</w:t>
+        <w:t xml:space="preserve">Figura 12. Constantes, normalización y tokenización del texto. Archivo: backend/app/nucleo/preprocesamiento.py.</w:t>
       </w:r>
     </w:p>
     <w:p>
@@ -5014,17 +4990,115 @@
       <w:r>
         <w:drawing>
           <wp:inline distT="0" distB="0" distL="0" distR="0">
-            <wp:extent cx="4517136" cy="2731008"/>
+            <wp:extent cx="4718304" cy="2731008"/>
             <wp:docPr id="113" name="Imagen 113"/>
             <a:graphic xmlns:a="http://schemas.openxmlformats.org/drawingml/2006/main">
               <a:graphicData uri="http://schemas.openxmlformats.org/drawingml/2006/picture">
                 <pic:pic xmlns:pic="http://schemas.openxmlformats.org/drawingml/2006/picture">
                   <pic:nvPicPr>
-                    <pic:cNvPr id="113" name="seg_pre_pares.png"/>
+                    <pic:cNvPr id="113" name="seg_pre_limpieza.png"/>
                     <pic:cNvPicPr/>
                   </pic:nvPicPr>
                   <pic:blipFill>
                     <a:blip r:embed="rIdSeg113"/>
+                    <a:stretch>
+                      <a:fillRect/>
+                    </a:stretch>
+                  </pic:blipFill>
+                  <pic:spPr>
+                    <a:xfrm>
+                      <a:off x="0" y="0"/>
+                      <a:ext cx="4718304" cy="2731008"/>
+                    </a:xfrm>
+                    <a:prstGeom prst="rect">
+                      <a:avLst/>
+                    </a:prstGeom>
+                    <a:ln w="6350">
+                      <a:solidFill>
+                        <a:srgbClr val="404040"/>
+                      </a:solidFill>
+                    </a:ln>
+                  </pic:spPr>
+                </pic:pic>
+              </a:graphicData>
+            </a:graphic>
+          </wp:inline>
+        </w:drawing>
+      </w:r>
+    </w:p>
+    <w:p>
+      <w:pPr>
+        <w:spacing w:before="0" w:after="200" w:line="276" w:lineRule="auto"/>
+        <w:jc w:val="center"/>
+      </w:pPr>
+      <w:r>
+        <w:rPr>
+          <w:rFonts w:ascii="Arial" w:cs="Arial" w:eastAsia="Arial" w:hAnsi="Arial"/>
+          <w:i/>
+          <w:sz w:val="18"/>
+          <w:szCs w:val="18"/>
+        </w:rPr>
+        <w:t xml:space="preserve">Figura 13. Limpieza de tokens con la excepción de siglas y conteo de frecuencias. Archivo: backend/app/nucleo/preprocesamiento.py.</w:t>
+      </w:r>
+    </w:p>
+    <w:p>
+      <w:pPr>
+        <w:spacing w:before="0" w:after="140" w:line="276" w:lineRule="auto"/>
+        <w:jc w:val="both"/>
+      </w:pPr>
+      <w:r>
+        <w:rPr>
+          <w:rFonts w:ascii="Arial" w:cs="Arial" w:eastAsia="Arial" w:hAnsi="Arial"/>
+          <w:b/>
+          <w:sz w:val="22"/>
+          <w:szCs w:val="22"/>
+        </w:rPr>
+        <w:t xml:space="preserve">Ejemplo. </w:t>
+      </w:r>
+      <w:r>
+        <w:rPr>
+          <w:rFonts w:ascii="Arial" w:cs="Arial" w:eastAsia="Arial" w:hAnsi="Arial"/>
+          <w:sz w:val="22"/>
+          <w:szCs w:val="22"/>
+        </w:rPr>
+        <w:t xml:space="preserve">La frase Artificial intelligence (AI) is finding its way into education queda como los tokens artificial, intelligence, ai, finding, way, education. Se eliminó is por tener menos de tres letras, its e into por ser palabras vacías, y ai se conservó por estar en SIGLAS_CONSERVADAS.</w:t>
+      </w:r>
+    </w:p>
+    <w:p>
+      <w:pPr>
+        <w:keepNext/>
+        <w:spacing w:before="0" w:after="140" w:line="276" w:lineRule="auto"/>
+        <w:jc w:val="both"/>
+      </w:pPr>
+      <w:r>
+        <w:rPr>
+          <w:rFonts w:ascii="Arial" w:cs="Arial" w:eastAsia="Arial" w:hAnsi="Arial"/>
+          <w:sz w:val="22"/>
+          <w:szCs w:val="22"/>
+        </w:rPr>
+        <w:t xml:space="preserve">Con esas funciones, el servicio del ranking une los tokens de los 20 abstracts, cuenta las frecuencias y arma la lista de pares (término, frecuencia). Esa lista se ordena una vez alfabéticamente: es solo preparación de los datos para que los empates queden en orden alfabético, no es parte de los algoritmos evaluados.</w:t>
+      </w:r>
+    </w:p>
+    <w:p>
+      <w:pPr>
+        <w:keepNext/>
+        <w:spacing w:before="60" w:after="40" w:line="276" w:lineRule="auto"/>
+        <w:jc w:val="center"/>
+      </w:pPr>
+      <w:r>
+        <w:drawing>
+          <wp:inline distT="0" distB="0" distL="0" distR="0">
+            <wp:extent cx="4517136" cy="2731008"/>
+            <wp:docPr id="114" name="Imagen 114"/>
+            <a:graphic xmlns:a="http://schemas.openxmlformats.org/drawingml/2006/main">
+              <a:graphicData uri="http://schemas.openxmlformats.org/drawingml/2006/picture">
+                <pic:pic xmlns:pic="http://schemas.openxmlformats.org/drawingml/2006/picture">
+                  <pic:nvPicPr>
+                    <pic:cNvPr id="114" name="seg_pre_pares.png"/>
+                    <pic:cNvPicPr/>
+                  </pic:nvPicPr>
+                  <pic:blipFill>
+                    <a:blip r:embed="rIdSeg114"/>
                     <a:stretch>
                       <a:fillRect/>
                     </a:stretch>
@@ -5062,7 +5136,7 @@
           <w:sz w:val="18"/>
           <w:szCs w:val="18"/>
         </w:rPr>
-        <w:t xml:space="preserve">Figura 13. Construcción de la lista de pares que reciben los tres algoritmos. Archivo: backend/app/servicios/ranking.py.</w:t>
+        <w:t xml:space="preserve">Figura 14. Construcción de la lista de pares que reciben los tres algoritmos. Archivo: backend/app/servicios/ranking.py.</w:t>
       </w:r>
     </w:p>
     <w:p>
@@ -5241,7 +5315,7 @@
                 <w:sz w:val="19"/>
                 <w:szCs w:val="19"/>
               </w:rPr>
-              <w:t xml:space="preserve">959</w:t>
+              <w:t xml:space="preserve">960</w:t>
             </w:r>
           </w:p>
         </w:tc>
@@ -5309,7 +5383,7 @@
                 <w:sz w:val="19"/>
                 <w:szCs w:val="19"/>
               </w:rPr>
-              <w:t xml:space="preserve">57</w:t>
+              <w:t xml:space="preserve">86</w:t>
             </w:r>
           </w:p>
         </w:tc>
@@ -5757,16 +5831,16 @@
         <w:drawing>
           <wp:inline distT="0" distB="0" distL="0" distR="0">
             <wp:extent cx="4760976" cy="2365248"/>
-            <wp:docPr id="114" name="Imagen 114"/>
+            <wp:docPr id="115" name="Imagen 115"/>
             <a:graphic xmlns:a="http://schemas.openxmlformats.org/drawingml/2006/main">
               <a:graphicData uri="http://schemas.openxmlformats.org/drawingml/2006/picture">
                 <pic:pic xmlns:pic="http://schemas.openxmlformats.org/drawingml/2006/picture">
                   <pic:nvPicPr>
-                    <pic:cNvPr id="114" name="seg_counting_principal.png"/>
+                    <pic:cNvPr id="115" name="seg_counting_principal.png"/>
                     <pic:cNvPicPr/>
                   </pic:nvPicPr>
                   <pic:blipFill>
-                    <a:blip r:embed="rIdSeg114"/>
+                    <a:blip r:embed="rIdSeg115"/>
                     <a:stretch>
                       <a:fillRect/>
                     </a:stretch>
@@ -5804,7 +5878,7 @@
           <w:sz w:val="18"/>
           <w:szCs w:val="18"/>
         </w:rPr>
-        <w:t xml:space="preserve">Figura 14. Función counting_sort: busca la frecuencia máxima k y llama al núcleo. Archivo: backend/app/algoritmos/ordenamiento/counting_sort.py.</w:t>
+        <w:t xml:space="preserve">Figura 15. Función counting_sort: busca la frecuencia máxima k y llama al núcleo. Archivo: backend/app/algoritmos/ordenamiento/counting_sort.py.</w:t>
       </w:r>
     </w:p>
     <w:p>
@@ -5817,16 +5891,16 @@
         <w:drawing>
           <wp:inline distT="0" distB="0" distL="0" distR="0">
             <wp:extent cx="4864608" cy="3828288"/>
-            <wp:docPr id="115" name="Imagen 115"/>
+            <wp:docPr id="116" name="Imagen 116"/>
             <a:graphic xmlns:a="http://schemas.openxmlformats.org/drawingml/2006/main">
               <a:graphicData uri="http://schemas.openxmlformats.org/drawingml/2006/picture">
                 <pic:pic xmlns:pic="http://schemas.openxmlformats.org/drawingml/2006/picture">
                   <pic:nvPicPr>
-                    <pic:cNvPr id="115" name="seg_counting_nucleo.png"/>
+                    <pic:cNvPr id="116" name="seg_counting_nucleo.png"/>
                     <pic:cNvPicPr/>
                   </pic:nvPicPr>
                   <pic:blipFill>
-                    <a:blip r:embed="rIdSeg115"/>
+                    <a:blip r:embed="rIdSeg116"/>
                     <a:stretch>
                       <a:fillRect/>
                     </a:stretch>
@@ -5864,7 +5938,7 @@
           <w:sz w:val="18"/>
           <w:szCs w:val="18"/>
         </w:rPr>
-        <w:t xml:space="preserve">Figura 15. Núcleo de Counting Sort, compartido con Radix Sort. Archivo: backend/app/algoritmos/ordenamiento/counting_sort.py.</w:t>
+        <w:t xml:space="preserve">Figura 16. Núcleo de Counting Sort, compartido con Radix Sort. Archivo: backend/app/algoritmos/ordenamiento/counting_sort.py.</w:t>
       </w:r>
     </w:p>
     <w:p>
@@ -5897,7 +5971,7 @@
           <w:sz w:val="22"/>
           <w:szCs w:val="22"/>
         </w:rPr>
-        <w:t xml:space="preserve">Tabla de la función counting_sort (Figura 14):</w:t>
+        <w:t xml:space="preserve">Tabla de la función counting_sort (Figura 15):</w:t>
       </w:r>
     </w:p>
     <w:tbl>
@@ -6504,7 +6578,7 @@
           <w:sz w:val="22"/>
           <w:szCs w:val="22"/>
         </w:rPr>
-        <w:t xml:space="preserve">Tabla del núcleo ordenar_por_clave_descendente (Figura 15):</w:t>
+        <w:t xml:space="preserve">Tabla del núcleo ordenar_por_clave_descendente (Figura 16):</w:t>
       </w:r>
     </w:p>
     <w:tbl>
@@ -7733,7 +7807,7 @@
           <w:sz w:val="22"/>
           <w:szCs w:val="22"/>
         </w:rPr>
-        <w:t xml:space="preserve">El algoritmo tiene dos ciclos que recorren los n pares y dos que recorren las k + 1 casillas, pero ninguno está dentro de otro, así que los costos se suman y no se multiplican. Por eso logra tiempo lineal sin hacer comparaciones entre elementos. En el corpus k = 57 es mucho menor que n = 959, así que en la práctica se comporta como O(n). Con los valores del corpus: T = 11(959) + 3(57) + 12 = 10.732 operaciones.</w:t>
+        <w:t xml:space="preserve">El algoritmo tiene dos ciclos que recorren los n pares y dos que recorren las k + 1 casillas, pero ninguno está dentro de otro, así que los costos se suman y no se multiplican. Por eso logra tiempo lineal sin hacer comparaciones entre elementos. En el corpus k = 86 es mucho menor que n = 960, así que en la práctica se comporta como O(n). Con los valores del corpus: T = 11(960) + 3(86) + 12 = 10.830 operaciones.</w:t>
       </w:r>
     </w:p>
     <w:p>
@@ -7911,16 +7985,16 @@
         <w:drawing>
           <wp:inline distT="0" distB="0" distL="0" distR="0">
             <wp:extent cx="5120640" cy="3828288"/>
-            <wp:docPr id="116" name="Imagen 116"/>
+            <wp:docPr id="117" name="Imagen 117"/>
             <a:graphic xmlns:a="http://schemas.openxmlformats.org/drawingml/2006/main">
               <a:graphicData uri="http://schemas.openxmlformats.org/drawingml/2006/picture">
                 <pic:pic xmlns:pic="http://schemas.openxmlformats.org/drawingml/2006/picture">
                   <pic:nvPicPr>
-                    <pic:cNvPr id="116" name="seg_radix.png"/>
+                    <pic:cNvPr id="117" name="seg_radix.png"/>
                     <pic:cNvPicPr/>
                   </pic:nvPicPr>
                   <pic:blipFill>
-                    <a:blip r:embed="rIdSeg116"/>
+                    <a:blip r:embed="rIdSeg117"/>
                     <a:stretch>
                       <a:fillRect/>
                     </a:stretch>
@@ -7958,7 +8032,7 @@
           <w:sz w:val="18"/>
           <w:szCs w:val="18"/>
         </w:rPr>
-        <w:t xml:space="preserve">Figura 16. Radix Sort: una pasada del núcleo de Counting Sort por cada dígito. Archivo: backend/app/algoritmos/ordenamiento/radix_sort.py.</w:t>
+        <w:t xml:space="preserve">Figura 17. Radix Sort: una pasada del núcleo de Counting Sort por cada dígito. Archivo: backend/app/algoritmos/ordenamiento/radix_sort.py.</w:t>
       </w:r>
     </w:p>
     <w:p>
@@ -9236,7 +9310,7 @@
           <w:sz w:val="22"/>
           <w:szCs w:val="22"/>
         </w:rPr>
-        <w:t xml:space="preserve">La cantidad de dígitos d solo crece con el logaritmo de la frecuencia máxima (d = ⌊log₁₀ k⌋ + 1), y la base b = 10 es fija. En el corpus, k = 57 tiene d = 2 dígitos, así que d y b son constantes y la complejidad queda en O(n).</w:t>
+        <w:t xml:space="preserve">La cantidad de dígitos d solo crece con el logaritmo de la frecuencia máxima (d = ⌊log₁₀ k⌋ + 1), y la base b = 10 es fija. En el corpus, k = 86 tiene d = 2 dígitos, así que d y b son constantes y la complejidad queda en O(n).</w:t>
       </w:r>
     </w:p>
     <w:p>
@@ -9250,7 +9324,7 @@
           <w:sz w:val="22"/>
           <w:szCs w:val="22"/>
         </w:rPr>
-        <w:t xml:space="preserve">Con los valores del corpus: T = 8(2)(959) + 3(959) + 38(2) + 8 = 19n + 84 = 18.305 operaciones. Es más que Counting Sort porque recorre los datos una vez por cada dígito (dos pasadas completas).</w:t>
+        <w:t xml:space="preserve">Con los valores del corpus: T = 8(2)(960) + 3(960) + 38(2) + 8 = 19n + 84 = 18.324 operaciones. Es más que Counting Sort porque recorre los datos una vez por cada dígito (dos pasadas completas).</w:t>
       </w:r>
     </w:p>
     <w:p>
@@ -9375,16 +9449,16 @@
         <w:drawing>
           <wp:inline distT="0" distB="0" distL="0" distR="0">
             <wp:extent cx="4767072" cy="4925568"/>
-            <wp:docPr id="117" name="Imagen 117"/>
+            <wp:docPr id="118" name="Imagen 118"/>
             <a:graphic xmlns:a="http://schemas.openxmlformats.org/drawingml/2006/main">
               <a:graphicData uri="http://schemas.openxmlformats.org/drawingml/2006/picture">
                 <pic:pic xmlns:pic="http://schemas.openxmlformats.org/drawingml/2006/picture">
                   <pic:nvPicPr>
-                    <pic:cNvPr id="117" name="seg_bucket_principal.png"/>
+                    <pic:cNvPr id="118" name="seg_bucket_principal.png"/>
                     <pic:cNvPicPr/>
                   </pic:nvPicPr>
                   <pic:blipFill>
-                    <a:blip r:embed="rIdSeg117"/>
+                    <a:blip r:embed="rIdSeg118"/>
                     <a:stretch>
                       <a:fillRect/>
                     </a:stretch>
@@ -9422,7 +9496,7 @@
           <w:sz w:val="18"/>
           <w:szCs w:val="18"/>
         </w:rPr>
-        <w:t xml:space="preserve">Figura 17. Bucket Sort: distribución en cubetas y unión. Archivo: backend/app/algoritmos/ordenamiento/bucket_sort.py.</w:t>
+        <w:t xml:space="preserve">Figura 18. Bucket Sort: distribución en cubetas y unión. Archivo: backend/app/algoritmos/ordenamiento/bucket_sort.py.</w:t>
       </w:r>
     </w:p>
     <w:p>
@@ -9435,16 +9509,16 @@
         <w:drawing>
           <wp:inline distT="0" distB="0" distL="0" distR="0">
             <wp:extent cx="4712208" cy="1511808"/>
-            <wp:docPr id="118" name="Imagen 118"/>
+            <wp:docPr id="119" name="Imagen 119"/>
             <a:graphic xmlns:a="http://schemas.openxmlformats.org/drawingml/2006/main">
               <a:graphicData uri="http://schemas.openxmlformats.org/drawingml/2006/picture">
                 <pic:pic xmlns:pic="http://schemas.openxmlformats.org/drawingml/2006/picture">
                   <pic:nvPicPr>
-                    <pic:cNvPr id="118" name="seg_bucket_insercion.png"/>
+                    <pic:cNvPr id="119" name="seg_bucket_insercion.png"/>
                     <pic:cNvPicPr/>
                   </pic:nvPicPr>
                   <pic:blipFill>
-                    <a:blip r:embed="rIdSeg118"/>
+                    <a:blip r:embed="rIdSeg119"/>
                     <a:stretch>
                       <a:fillRect/>
                     </a:stretch>
@@ -9482,7 +9556,7 @@
           <w:sz w:val="18"/>
           <w:szCs w:val="18"/>
         </w:rPr>
-        <w:t xml:space="preserve">Figura 18. Inserción estable dentro de una cubeta. Archivo: backend/app/algoritmos/ordenamiento/bucket_sort.py.</w:t>
+        <w:t xml:space="preserve">Figura 19. Inserción estable dentro de una cubeta. Archivo: backend/app/algoritmos/ordenamiento/bucket_sort.py.</w:t>
       </w:r>
     </w:p>
     <w:p>
@@ -9515,7 +9589,7 @@
           <w:sz w:val="22"/>
           <w:szCs w:val="22"/>
         </w:rPr>
-        <w:t xml:space="preserve">Primero se analiza la inserción (Figura 18). Si s es la cantidad de elementos que hay que desplazar para insertar uno nuevo:</w:t>
+        <w:t xml:space="preserve">Primero se analiza la inserción (Figura 19). Si s es la cantidad de elementos que hay que desplazar para insertar uno nuevo:</w:t>
       </w:r>
     </w:p>
     <w:tbl>
@@ -10054,7 +10128,7 @@
           <w:sz w:val="22"/>
           <w:szCs w:val="22"/>
         </w:rPr>
-        <w:t xml:space="preserve">Ahora la función principal (Figura 17):</w:t>
+        <w:t xml:space="preserve">Ahora la función principal (Figura 18):</w:t>
       </w:r>
     </w:p>
     <w:tbl>
@@ -11960,7 +12034,7 @@
           <w:sz w:val="22"/>
           <w:szCs w:val="22"/>
         </w:rPr>
-        <w:t xml:space="preserve">En el corpus se cumple el caso promedio: hay m = 959 cubetas y solo 57 valores posibles de frecuencia, así que cada cubeta recibe una sola frecuencia. Los elementos repetidos llegan en orden alfabético y la inserción nunca desplaza nada, por eso en la práctica se comporta como Counting Sort. Con n = 959: T = 17(959) + 13 = 16.316 operaciones.</w:t>
+        <w:t xml:space="preserve">En el corpus se cumple el caso promedio: hay m = 960 cubetas y solo 86 valores posibles de frecuencia, así que cada cubeta recibe una sola frecuencia. Los elementos repetidos llegan en orden alfabético y la inserción nunca desplaza nada, por eso en la práctica se comporta como Counting Sort. Con n = 960: T = 17(960) + 13 = 16.333 operaciones.</w:t>
       </w:r>
     </w:p>
     <w:p>
@@ -11993,7 +12067,7 @@
           <w:sz w:val="22"/>
           <w:szCs w:val="22"/>
         </w:rPr>
-        <w:t xml:space="preserve">Los tres algoritmos se ejecutaron sobre la lista de frecuencias del corpus completo (n = 959 pares), 50 veces cada uno, midiendo el tiempo con time.perf_counter, que es el reloj de mayor precisión de Python.</w:t>
+        <w:t xml:space="preserve">Los tres algoritmos se ejecutaron sobre la lista de frecuencias del corpus completo (n = 960 pares), 50 veces cada uno, midiendo el tiempo con time.perf_counter, que es el reloj de mayor precisión de Python.</w:t>
       </w:r>
     </w:p>
     <w:tbl>
@@ -12067,7 +12141,7 @@
                 <w:sz w:val="19"/>
                 <w:szCs w:val="19"/>
               </w:rPr>
-              <w:t xml:space="preserve">T(n) con n = 959</w:t>
+              <w:t xml:space="preserve">T(n) con n = 960</w:t>
             </w:r>
           </w:p>
         </w:tc>
@@ -12160,7 +12234,7 @@
                 <w:sz w:val="19"/>
                 <w:szCs w:val="19"/>
               </w:rPr>
-              <w:t xml:space="preserve">10.732</w:t>
+              <w:t xml:space="preserve">10.830</w:t>
             </w:r>
           </w:p>
         </w:tc>
@@ -12181,7 +12255,7 @@
                 <w:sz w:val="19"/>
                 <w:szCs w:val="19"/>
               </w:rPr>
-              <w:t xml:space="preserve">0,541</w:t>
+              <w:t xml:space="preserve">0,434</w:t>
             </w:r>
           </w:p>
         </w:tc>
@@ -12202,7 +12276,7 @@
                 <w:sz w:val="19"/>
                 <w:szCs w:val="19"/>
               </w:rPr>
-              <w:t xml:space="preserve">0,880</w:t>
+              <w:t xml:space="preserve">0,439</w:t>
             </w:r>
           </w:p>
         </w:tc>
@@ -12249,7 +12323,7 @@
                 <w:sz w:val="19"/>
                 <w:szCs w:val="19"/>
               </w:rPr>
-              <w:t xml:space="preserve">16.316</w:t>
+              <w:t xml:space="preserve">16.333</w:t>
             </w:r>
           </w:p>
         </w:tc>
@@ -12270,7 +12344,7 @@
                 <w:sz w:val="19"/>
                 <w:szCs w:val="19"/>
               </w:rPr>
-              <w:t xml:space="preserve">0,700</w:t>
+              <w:t xml:space="preserve">0,703</w:t>
             </w:r>
           </w:p>
         </w:tc>
@@ -12291,7 +12365,7 @@
                 <w:sz w:val="19"/>
                 <w:szCs w:val="19"/>
               </w:rPr>
-              <w:t xml:space="preserve">0,860</w:t>
+              <w:t xml:space="preserve">0,717</w:t>
             </w:r>
           </w:p>
         </w:tc>
@@ -12336,7 +12410,7 @@
                 <w:sz w:val="19"/>
                 <w:szCs w:val="19"/>
               </w:rPr>
-              <w:t xml:space="preserve">18.305</w:t>
+              <w:t xml:space="preserve">18.324</w:t>
             </w:r>
           </w:p>
         </w:tc>
@@ -12356,7 +12430,7 @@
                 <w:sz w:val="19"/>
                 <w:szCs w:val="19"/>
               </w:rPr>
-              <w:t xml:space="preserve">1,008</w:t>
+              <w:t xml:space="preserve">0,990</w:t>
             </w:r>
           </w:p>
         </w:tc>
@@ -12376,7 +12450,7 @@
                 <w:sz w:val="19"/>
                 <w:szCs w:val="19"/>
               </w:rPr>
-              <w:t xml:space="preserve">1,499</w:t>
+              <w:t xml:space="preserve">1,201</w:t>
             </w:r>
           </w:p>
         </w:tc>
@@ -12560,7 +12634,7 @@
                 <w:sz w:val="19"/>
                 <w:szCs w:val="19"/>
               </w:rPr>
-              <w:t xml:space="preserve">959</w:t>
+              <w:t xml:space="preserve">960</w:t>
             </w:r>
           </w:p>
         </w:tc>
@@ -12581,7 +12655,7 @@
                 <w:sz w:val="19"/>
                 <w:szCs w:val="19"/>
               </w:rPr>
-              <w:t xml:space="preserve">0,463</w:t>
+              <w:t xml:space="preserve">0,438</w:t>
             </w:r>
           </w:p>
         </w:tc>
@@ -12602,7 +12676,7 @@
                 <w:sz w:val="19"/>
                 <w:szCs w:val="19"/>
               </w:rPr>
-              <w:t xml:space="preserve">1,204</w:t>
+              <w:t xml:space="preserve">1,001</w:t>
             </w:r>
           </w:p>
         </w:tc>
@@ -12623,7 +12697,7 @@
                 <w:sz w:val="19"/>
                 <w:szCs w:val="19"/>
               </w:rPr>
-              <w:t xml:space="preserve">0,830</w:t>
+              <w:t xml:space="preserve">0,693</w:t>
             </w:r>
           </w:p>
         </w:tc>
@@ -12649,7 +12723,7 @@
                 <w:sz w:val="19"/>
                 <w:szCs w:val="19"/>
               </w:rPr>
-              <w:t xml:space="preserve">1.918</w:t>
+              <w:t xml:space="preserve">1.920</w:t>
             </w:r>
           </w:p>
         </w:tc>
@@ -12670,7 +12744,7 @@
                 <w:sz w:val="19"/>
                 <w:szCs w:val="19"/>
               </w:rPr>
-              <w:t xml:space="preserve">1,162</w:t>
+              <w:t xml:space="preserve">0,742</w:t>
             </w:r>
           </w:p>
         </w:tc>
@@ -12691,7 +12765,7 @@
                 <w:sz w:val="19"/>
                 <w:szCs w:val="19"/>
               </w:rPr>
-              <w:t xml:space="preserve">3,848</w:t>
+              <w:t xml:space="preserve">1,582</w:t>
             </w:r>
           </w:p>
         </w:tc>
@@ -12712,7 +12786,7 @@
                 <w:sz w:val="19"/>
                 <w:szCs w:val="19"/>
               </w:rPr>
-              <w:t xml:space="preserve">2,566</w:t>
+              <w:t xml:space="preserve">1,121</w:t>
             </w:r>
           </w:p>
         </w:tc>
@@ -12738,7 +12812,7 @@
                 <w:sz w:val="19"/>
                 <w:szCs w:val="19"/>
               </w:rPr>
-              <w:t xml:space="preserve">3.836</w:t>
+              <w:t xml:space="preserve">3.840</w:t>
             </w:r>
           </w:p>
         </w:tc>
@@ -12759,7 +12833,7 @@
                 <w:sz w:val="19"/>
                 <w:szCs w:val="19"/>
               </w:rPr>
-              <w:t xml:space="preserve">3,486</w:t>
+              <w:t xml:space="preserve">1,366</w:t>
             </w:r>
           </w:p>
         </w:tc>
@@ -12780,7 +12854,7 @@
                 <w:sz w:val="19"/>
                 <w:szCs w:val="19"/>
               </w:rPr>
-              <w:t xml:space="preserve">5,589</w:t>
+              <w:t xml:space="preserve">3,158</w:t>
             </w:r>
           </w:p>
         </w:tc>
@@ -12801,7 +12875,7 @@
                 <w:sz w:val="19"/>
                 <w:szCs w:val="19"/>
               </w:rPr>
-              <w:t xml:space="preserve">5,298</w:t>
+              <w:t xml:space="preserve">2,552</w:t>
             </w:r>
           </w:p>
         </w:tc>
@@ -12826,7 +12900,7 @@
                 <w:sz w:val="19"/>
                 <w:szCs w:val="19"/>
               </w:rPr>
-              <w:t xml:space="preserve">7.672</w:t>
+              <w:t xml:space="preserve">7.680</w:t>
             </w:r>
           </w:p>
         </w:tc>
@@ -12846,7 +12920,7 @@
                 <w:sz w:val="19"/>
                 <w:szCs w:val="19"/>
               </w:rPr>
-              <w:t xml:space="preserve">4,828</w:t>
+              <w:t xml:space="preserve">2,814</w:t>
             </w:r>
           </w:p>
         </w:tc>
@@ -12866,7 +12940,7 @@
                 <w:sz w:val="19"/>
                 <w:szCs w:val="19"/>
               </w:rPr>
-              <w:t xml:space="preserve">10,024</w:t>
+              <w:t xml:space="preserve">6,399</w:t>
             </w:r>
           </w:p>
         </w:tc>
@@ -12886,7 +12960,7 @@
                 <w:sz w:val="19"/>
                 <w:szCs w:val="19"/>
               </w:rPr>
-              <w:t xml:space="preserve">7,663</w:t>
+              <w:t xml:space="preserve">5,067</w:t>
             </w:r>
           </w:p>
         </w:tc>
@@ -12908,16 +12982,16 @@
         <w:drawing>
           <wp:inline distT="0" distB="0" distL="0" distR="0">
             <wp:extent cx="5303520" cy="3030582"/>
-            <wp:docPr id="119" name="Imagen 119"/>
+            <wp:docPr id="120" name="Imagen 120"/>
             <a:graphic xmlns:a="http://schemas.openxmlformats.org/drawingml/2006/main">
               <a:graphicData uri="http://schemas.openxmlformats.org/drawingml/2006/picture">
                 <pic:pic xmlns:pic="http://schemas.openxmlformats.org/drawingml/2006/picture">
                   <pic:nvPicPr>
-                    <pic:cNvPr id="119" name="seg_escalamiento.png"/>
+                    <pic:cNvPr id="120" name="seg_escalamiento.png"/>
                     <pic:cNvPicPr/>
                   </pic:nvPicPr>
                   <pic:blipFill>
-                    <a:blip r:embed="rIdSeg119"/>
+                    <a:blip r:embed="rIdSeg120"/>
                     <a:stretch>
                       <a:fillRect/>
                     </a:stretch>
@@ -12955,7 +13029,7 @@
           <w:sz w:val="18"/>
           <w:szCs w:val="18"/>
         </w:rPr>
-        <w:t xml:space="preserve">Figura 19. Tiempo de ejecución de los tres algoritmos al duplicar n.</w:t>
+        <w:t xml:space="preserve">Figura 20. Tiempo de ejecución de los tres algoritmos al duplicar n.</w:t>
       </w:r>
     </w:p>
     <w:p>
@@ -13217,7 +13291,7 @@
                 <w:sz w:val="19"/>
                 <w:szCs w:val="19"/>
               </w:rPr>
-              <w:t xml:space="preserve">education</w:t>
+              <w:t xml:space="preserve">ai</w:t>
             </w:r>
           </w:p>
         </w:tc>
@@ -13238,7 +13312,7 @@
                 <w:sz w:val="19"/>
                 <w:szCs w:val="19"/>
               </w:rPr>
-              <w:t xml:space="preserve">57</w:t>
+              <w:t xml:space="preserve">86</w:t>
             </w:r>
           </w:p>
         </w:tc>
@@ -13348,7 +13422,7 @@
                 <w:sz w:val="19"/>
                 <w:szCs w:val="19"/>
               </w:rPr>
-              <w:t xml:space="preserve">research</w:t>
+              <w:t xml:space="preserve">education</w:t>
             </w:r>
           </w:p>
         </w:tc>
@@ -13369,7 +13443,7 @@
                 <w:sz w:val="19"/>
                 <w:szCs w:val="19"/>
               </w:rPr>
-              <w:t xml:space="preserve">46</w:t>
+              <w:t xml:space="preserve">57</w:t>
             </w:r>
           </w:p>
         </w:tc>
@@ -13479,7 +13553,7 @@
                 <w:sz w:val="19"/>
                 <w:szCs w:val="19"/>
               </w:rPr>
-              <w:t xml:space="preserve">learning</w:t>
+              <w:t xml:space="preserve">research</w:t>
             </w:r>
           </w:p>
         </w:tc>
@@ -13500,7 +13574,7 @@
                 <w:sz w:val="19"/>
                 <w:szCs w:val="19"/>
               </w:rPr>
-              <w:t xml:space="preserve">40</w:t>
+              <w:t xml:space="preserve">46</w:t>
             </w:r>
           </w:p>
         </w:tc>
@@ -13610,7 +13684,7 @@
                 <w:sz w:val="19"/>
                 <w:szCs w:val="19"/>
               </w:rPr>
-              <w:t xml:space="preserve">aied</w:t>
+              <w:t xml:space="preserve">learning</w:t>
             </w:r>
           </w:p>
         </w:tc>
@@ -13631,7 +13705,7 @@
                 <w:sz w:val="19"/>
                 <w:szCs w:val="19"/>
               </w:rPr>
-              <w:t xml:space="preserve">38</w:t>
+              <w:t xml:space="preserve">40</w:t>
             </w:r>
           </w:p>
         </w:tc>
@@ -13741,7 +13815,7 @@
                 <w:sz w:val="19"/>
                 <w:szCs w:val="19"/>
               </w:rPr>
-              <w:t xml:space="preserve">review</w:t>
+              <w:t xml:space="preserve">aied</w:t>
             </w:r>
           </w:p>
         </w:tc>
@@ -13762,7 +13836,7 @@
                 <w:sz w:val="19"/>
                 <w:szCs w:val="19"/>
               </w:rPr>
-              <w:t xml:space="preserve">36</w:t>
+              <w:t xml:space="preserve">38</w:t>
             </w:r>
           </w:p>
         </w:tc>
@@ -13872,7 +13946,7 @@
                 <w:sz w:val="19"/>
                 <w:szCs w:val="19"/>
               </w:rPr>
-              <w:t xml:space="preserve">educational</w:t>
+              <w:t xml:space="preserve">review</w:t>
             </w:r>
           </w:p>
         </w:tc>
@@ -13893,7 +13967,7 @@
                 <w:sz w:val="19"/>
                 <w:szCs w:val="19"/>
               </w:rPr>
-              <w:t xml:space="preserve">33</w:t>
+              <w:t xml:space="preserve">36</w:t>
             </w:r>
           </w:p>
         </w:tc>
@@ -14003,7 +14077,7 @@
                 <w:sz w:val="19"/>
                 <w:szCs w:val="19"/>
               </w:rPr>
-              <w:t xml:space="preserve">assessment</w:t>
+              <w:t xml:space="preserve">educational</w:t>
             </w:r>
           </w:p>
         </w:tc>
@@ -14024,7 +14098,7 @@
                 <w:sz w:val="19"/>
                 <w:szCs w:val="19"/>
               </w:rPr>
-              <w:t xml:space="preserve">32</w:t>
+              <w:t xml:space="preserve">33</w:t>
             </w:r>
           </w:p>
         </w:tc>
@@ -14134,7 +14208,7 @@
                 <w:sz w:val="19"/>
                 <w:szCs w:val="19"/>
               </w:rPr>
-              <w:t xml:space="preserve">intelligence</w:t>
+              <w:t xml:space="preserve">assessment</w:t>
             </w:r>
           </w:p>
         </w:tc>
@@ -14155,7 +14229,7 @@
                 <w:sz w:val="19"/>
                 <w:szCs w:val="19"/>
               </w:rPr>
-              <w:t xml:space="preserve">23</w:t>
+              <w:t xml:space="preserve">32</w:t>
             </w:r>
           </w:p>
         </w:tc>
@@ -14265,7 +14339,7 @@
                 <w:sz w:val="19"/>
                 <w:szCs w:val="19"/>
               </w:rPr>
-              <w:t xml:space="preserve">artificial</w:t>
+              <w:t xml:space="preserve">intelligence</w:t>
             </w:r>
           </w:p>
         </w:tc>
@@ -14286,7 +14360,7 @@
                 <w:sz w:val="19"/>
                 <w:szCs w:val="19"/>
               </w:rPr>
-              <w:t xml:space="preserve">22</w:t>
+              <w:t xml:space="preserve">23</w:t>
             </w:r>
           </w:p>
         </w:tc>
@@ -14396,7 +14470,7 @@
                 <w:sz w:val="19"/>
                 <w:szCs w:val="19"/>
               </w:rPr>
-              <w:t xml:space="preserve">studies</w:t>
+              <w:t xml:space="preserve">artificial</w:t>
             </w:r>
           </w:p>
         </w:tc>
@@ -14417,7 +14491,7 @@
                 <w:sz w:val="19"/>
                 <w:szCs w:val="19"/>
               </w:rPr>
-              <w:t xml:space="preserve">21</w:t>
+              <w:t xml:space="preserve">22</w:t>
             </w:r>
           </w:p>
         </w:tc>
@@ -14527,7 +14601,7 @@
                 <w:sz w:val="19"/>
                 <w:szCs w:val="19"/>
               </w:rPr>
-              <w:t xml:space="preserve">higher</w:t>
+              <w:t xml:space="preserve">studies</w:t>
             </w:r>
           </w:p>
         </w:tc>
@@ -14548,7 +14622,7 @@
                 <w:sz w:val="19"/>
                 <w:szCs w:val="19"/>
               </w:rPr>
-              <w:t xml:space="preserve">16</w:t>
+              <w:t xml:space="preserve">21</w:t>
             </w:r>
           </w:p>
         </w:tc>
@@ -14658,7 +14732,7 @@
                 <w:sz w:val="19"/>
                 <w:szCs w:val="19"/>
               </w:rPr>
-              <w:t xml:space="preserve">literature</w:t>
+              <w:t xml:space="preserve">higher</w:t>
             </w:r>
           </w:p>
         </w:tc>
@@ -14679,7 +14753,7 @@
                 <w:sz w:val="19"/>
                 <w:szCs w:val="19"/>
               </w:rPr>
-              <w:t xml:space="preserve">15</w:t>
+              <w:t xml:space="preserve">16</w:t>
             </w:r>
           </w:p>
         </w:tc>
@@ -14789,7 +14863,7 @@
                 <w:sz w:val="19"/>
                 <w:szCs w:val="19"/>
               </w:rPr>
-              <w:t xml:space="preserve">study</w:t>
+              <w:t xml:space="preserve">literature</w:t>
             </w:r>
           </w:p>
         </w:tc>
@@ -14920,7 +14994,7 @@
                 <w:sz w:val="19"/>
                 <w:szCs w:val="19"/>
               </w:rPr>
-              <w:t xml:space="preserve">systematic</w:t>
+              <w:t xml:space="preserve">study</w:t>
             </w:r>
           </w:p>
         </w:tc>
@@ -15049,7 +15123,7 @@
                 <w:sz w:val="19"/>
                 <w:szCs w:val="19"/>
               </w:rPr>
-              <w:t xml:space="preserve">technologies</w:t>
+              <w:t xml:space="preserve">systematic</w:t>
             </w:r>
           </w:p>
         </w:tc>
@@ -15198,16 +15272,16 @@
         <w:drawing>
           <wp:inline distT="0" distB="0" distL="0" distR="0">
             <wp:extent cx="5760720" cy="1522476"/>
-            <wp:docPr id="120" name="Imagen 120"/>
+            <wp:docPr id="121" name="Imagen 121"/>
             <a:graphic xmlns:a="http://schemas.openxmlformats.org/drawingml/2006/main">
               <a:graphicData uri="http://schemas.openxmlformats.org/drawingml/2006/picture">
                 <pic:pic xmlns:pic="http://schemas.openxmlformats.org/drawingml/2006/picture">
                   <pic:nvPicPr>
-                    <pic:cNvPr id="120" name="seg_app_encabezado.png"/>
+                    <pic:cNvPr id="121" name="seg_app_encabezado.png"/>
                     <pic:cNvPicPr/>
                   </pic:nvPicPr>
                   <pic:blipFill>
-                    <a:blip r:embed="rIdSeg120"/>
+                    <a:blip r:embed="rIdSeg121"/>
                     <a:stretch>
                       <a:fillRect/>
                     </a:stretch>
@@ -15245,7 +15319,7 @@
           <w:sz w:val="18"/>
           <w:szCs w:val="18"/>
         </w:rPr>
-        <w:t xml:space="preserve">Figura 20. Encabezado de la vista Ranking de términos con los datos del corpus.</w:t>
+        <w:t xml:space="preserve">Figura 21. Encabezado de la vista Ranking de términos con los datos del corpus.</w:t>
       </w:r>
     </w:p>
     <w:p>
@@ -15273,16 +15347,16 @@
         <w:drawing>
           <wp:inline distT="0" distB="0" distL="0" distR="0">
             <wp:extent cx="5760720" cy="3516115"/>
-            <wp:docPr id="121" name="Imagen 121"/>
+            <wp:docPr id="122" name="Imagen 122"/>
             <a:graphic xmlns:a="http://schemas.openxmlformats.org/drawingml/2006/main">
               <a:graphicData uri="http://schemas.openxmlformats.org/drawingml/2006/picture">
                 <pic:pic xmlns:pic="http://schemas.openxmlformats.org/drawingml/2006/picture">
                   <pic:nvPicPr>
-                    <pic:cNvPr id="121" name="seg_app_top15.png"/>
+                    <pic:cNvPr id="122" name="seg_app_top15.png"/>
                     <pic:cNvPicPr/>
                   </pic:nvPicPr>
                   <pic:blipFill>
-                    <a:blip r:embed="rIdSeg121"/>
+                    <a:blip r:embed="rIdSeg122"/>
                     <a:stretch>
                       <a:fillRect/>
                     </a:stretch>
@@ -15320,7 +15394,7 @@
           <w:sz w:val="18"/>
           <w:szCs w:val="18"/>
         </w:rPr>
-        <w:t xml:space="preserve">Figura 21. Top 15 términos obtenido con Counting Sort, con su gráfico de barras.</w:t>
+        <w:t xml:space="preserve">Figura 22. Top 15 términos obtenido con Counting Sort, con su gráfico de barras.</w:t>
       </w:r>
     </w:p>
     <w:p>
@@ -15348,16 +15422,16 @@
         <w:drawing>
           <wp:inline distT="0" distB="0" distL="0" distR="0">
             <wp:extent cx="5760720" cy="1362332"/>
-            <wp:docPr id="122" name="Imagen 122"/>
+            <wp:docPr id="123" name="Imagen 123"/>
             <a:graphic xmlns:a="http://schemas.openxmlformats.org/drawingml/2006/main">
               <a:graphicData uri="http://schemas.openxmlformats.org/drawingml/2006/picture">
                 <pic:pic xmlns:pic="http://schemas.openxmlformats.org/drawingml/2006/picture">
                   <pic:nvPicPr>
-                    <pic:cNvPr id="122" name="seg_app_tiempos.png"/>
+                    <pic:cNvPr id="123" name="seg_app_tiempos.png"/>
                     <pic:cNvPicPr/>
                   </pic:nvPicPr>
                   <pic:blipFill>
-                    <a:blip r:embed="rIdSeg122"/>
+                    <a:blip r:embed="rIdSeg123"/>
                     <a:stretch>
                       <a:fillRect/>
                     </a:stretch>
@@ -15395,7 +15469,7 @@
           <w:sz w:val="18"/>
           <w:szCs w:val="18"/>
         </w:rPr>
-        <w:t xml:space="preserve">Figura 22. Tiempos de ejecución y benchmark en la aplicación.</w:t>
+        <w:t xml:space="preserve">Figura 23. Tiempos de ejecución y benchmark en la aplicación.</w:t>
       </w:r>
     </w:p>
     <w:p>
@@ -15423,16 +15497,16 @@
         <w:drawing>
           <wp:inline distT="0" distB="0" distL="0" distR="0">
             <wp:extent cx="5486400" cy="2224216"/>
-            <wp:docPr id="123" name="Imagen 123"/>
+            <wp:docPr id="124" name="Imagen 124"/>
             <a:graphic xmlns:a="http://schemas.openxmlformats.org/drawingml/2006/main">
               <a:graphicData uri="http://schemas.openxmlformats.org/drawingml/2006/picture">
                 <pic:pic xmlns:pic="http://schemas.openxmlformats.org/drawingml/2006/picture">
                   <pic:nvPicPr>
-                    <pic:cNvPr id="123" name="seg_app_escalamiento.png"/>
+                    <pic:cNvPr id="124" name="seg_app_escalamiento.png"/>
                     <pic:cNvPicPr/>
                   </pic:nvPicPr>
                   <pic:blipFill>
-                    <a:blip r:embed="rIdSeg123"/>
+                    <a:blip r:embed="rIdSeg124"/>
                     <a:stretch>
                       <a:fillRect/>
                     </a:stretch>
@@ -15470,7 +15544,7 @@
           <w:sz w:val="18"/>
           <w:szCs w:val="18"/>
         </w:rPr>
-        <w:t xml:space="preserve">Figura 23. Gráfica de escalamiento en la aplicación.</w:t>
+        <w:t xml:space="preserve">Figura 24. Gráfica de escalamiento en la aplicación.</w:t>
       </w:r>
     </w:p>
     <w:p>
@@ -15548,7 +15622,7 @@
           <w:sz w:val="22"/>
           <w:szCs w:val="22"/>
         </w:rPr>
-        <w:t xml:space="preserve">Counting Sort tiene T(n) = 11n + 3k + 12, es decir O(n + k). Es el más rápido en el corpus porque k = 57 es pequeño.</w:t>
+        <w:t xml:space="preserve">Counting Sort tiene T(n) = 11n + 3k + 12, es decir O(n + k). Es el más rápido en el corpus porque k = 86 es pequeño.</w:t>
       </w:r>
     </w:p>
     <w:p>

</xml_diff>